<commit_message>
Add Batch 1 and 2 triage register rules (26 new rules, refinements, test harness)
</commit_message>
<xml_diff>
--- a/tests/sample - annotated.docx
+++ b/tests/sample - annotated.docx
@@ -325,7 +325,7 @@
       <w:r>
         <w:t xml:space="preserve">The </w:t>
       </w:r>
-      <w:commentRangeStart w:id="22"/>
+      <w:commentRangeStart w:id="23"/>
       <w:r>
         <w:t xml:space="preserve">org</w:t>
       </w:r>
@@ -338,19 +338,27 @@
       <w:r>
         <w:t xml:space="preserve">d</w:t>
       </w:r>
+      <w:commentRangeEnd w:id="23"/>
+      <w:r>
+        <w:rPr>
+          <w:rStyle w:val="CommentReference"/>
+        </w:rPr>
+        <w:commentReference w:id="23"/>
+      </w:r>
+      <w:r>
+        <w:t xml:space="preserve"> committee met at </w:t>
+      </w:r>
+      <w:commentRangeStart w:id="21"/>
+      <w:commentRangeStart w:id="22"/>
+      <w:r>
+        <w:t xml:space="preserve">3.30pm</w:t>
+      </w:r>
       <w:commentRangeEnd w:id="22"/>
       <w:r>
         <w:rPr>
           <w:rStyle w:val="CommentReference"/>
         </w:rPr>
         <w:commentReference w:id="22"/>
-      </w:r>
-      <w:r>
-        <w:t xml:space="preserve"> committee met at </w:t>
-      </w:r>
-      <w:commentRangeStart w:id="21"/>
-      <w:r>
-        <w:t xml:space="preserve">3.30pm</w:t>
       </w:r>
       <w:commentRangeEnd w:id="21"/>
       <w:r>
@@ -388,16 +396,16 @@
             <w:tcW w:type="dxa" w:w="4320"/>
           </w:tcPr>
           <w:p>
-            <w:commentRangeStart w:id="23"/>
+            <w:commentRangeStart w:id="24"/>
             <w:r>
               <w:t xml:space="preserve">Approx.</w:t>
             </w:r>
-            <w:commentRangeEnd w:id="23"/>
+            <w:commentRangeEnd w:id="24"/>
             <w:r>
               <w:rPr>
                 <w:rStyle w:val="CommentReference"/>
               </w:rPr>
-              <w:commentReference w:id="23"/>
+              <w:commentReference w:id="24"/>
             </w:r>
             <w:r>
               <w:t xml:space="preserve"> 100 items</w:t>
@@ -418,7 +426,7 @@
 
 <file path=word/comments.xml><?xml version="1.0" encoding="utf-8"?>
 <w:comments xmlns:w="http://schemas.openxmlformats.org/wordprocessingml/2006/main">
-  <w:comment w:id="0" w:author="Style Manual Check" w:initials="SMC" w:date="2026-06-10T10:14:18Z">
+  <w:comment w:id="0" w:author="Style Manual Check" w:initials="SMC" w:date="2026-07-03T10:46:45Z">
     <w:p>
       <w:pPr>
         <w:pStyle w:val="CommentText"/>
@@ -476,7 +484,7 @@
       </w:r>
     </w:p>
   </w:comment>
-  <w:comment w:id="1" w:author="Style Manual Check" w:initials="SMC" w:date="2026-06-10T10:14:18Z">
+  <w:comment w:id="1" w:author="Style Manual Check" w:initials="SMC" w:date="2026-07-03T10:46:45Z">
     <w:p>
       <w:pPr>
         <w:pStyle w:val="CommentText"/>
@@ -502,7 +510,7 @@
       </w:r>
     </w:p>
   </w:comment>
-  <w:comment w:id="2" w:author="Style Manual Check" w:initials="SMC" w:date="2026-06-10T10:14:18Z">
+  <w:comment w:id="2" w:author="Style Manual Check" w:initials="SMC" w:date="2026-07-03T10:46:45Z">
     <w:p>
       <w:pPr>
         <w:pStyle w:val="CommentText"/>
@@ -528,7 +536,7 @@
       </w:r>
     </w:p>
   </w:comment>
-  <w:comment w:id="3" w:author="Style Manual Check" w:initials="SMC" w:date="2026-06-10T10:14:18Z">
+  <w:comment w:id="3" w:author="Style Manual Check" w:initials="SMC" w:date="2026-07-03T10:46:45Z">
     <w:p>
       <w:pPr>
         <w:pStyle w:val="CommentText"/>
@@ -554,7 +562,7 @@
       </w:r>
     </w:p>
   </w:comment>
-  <w:comment w:id="4" w:author="Style Manual Check" w:initials="SMC" w:date="2026-06-10T10:14:18Z">
+  <w:comment w:id="4" w:author="Style Manual Check" w:initials="SMC" w:date="2026-07-03T10:46:45Z">
     <w:p>
       <w:pPr>
         <w:pStyle w:val="CommentText"/>
@@ -580,7 +588,7 @@
       </w:r>
     </w:p>
   </w:comment>
-  <w:comment w:id="5" w:author="Style Manual Check" w:initials="SMC" w:date="2026-06-10T10:14:18Z">
+  <w:comment w:id="5" w:author="Style Manual Check" w:initials="SMC" w:date="2026-07-03T10:46:45Z">
     <w:p>
       <w:pPr>
         <w:pStyle w:val="CommentText"/>
@@ -606,7 +614,7 @@
       </w:r>
     </w:p>
   </w:comment>
-  <w:comment w:id="6" w:author="Style Manual Check" w:initials="SMC" w:date="2026-06-10T10:14:18Z">
+  <w:comment w:id="6" w:author="Style Manual Check" w:initials="SMC" w:date="2026-07-03T10:46:45Z">
     <w:p>
       <w:pPr>
         <w:pStyle w:val="CommentText"/>
@@ -632,7 +640,7 @@
       </w:r>
     </w:p>
   </w:comment>
-  <w:comment w:id="7" w:author="Style Manual Check" w:initials="SMC" w:date="2026-06-10T10:14:18Z">
+  <w:comment w:id="7" w:author="Style Manual Check" w:initials="SMC" w:date="2026-07-03T10:46:45Z">
     <w:p>
       <w:pPr>
         <w:pStyle w:val="CommentText"/>
@@ -658,7 +666,7 @@
       </w:r>
     </w:p>
   </w:comment>
-  <w:comment w:id="8" w:author="Style Manual Check" w:initials="SMC" w:date="2026-06-10T10:14:18Z">
+  <w:comment w:id="8" w:author="Style Manual Check" w:initials="SMC" w:date="2026-07-03T10:46:45Z">
     <w:p>
       <w:pPr>
         <w:pStyle w:val="CommentText"/>
@@ -684,7 +692,7 @@
       </w:r>
     </w:p>
   </w:comment>
-  <w:comment w:id="9" w:author="Style Manual Check" w:initials="SMC" w:date="2026-06-10T10:14:18Z">
+  <w:comment w:id="9" w:author="Style Manual Check" w:initials="SMC" w:date="2026-07-03T10:46:45Z">
     <w:p>
       <w:pPr>
         <w:pStyle w:val="CommentText"/>
@@ -710,7 +718,7 @@
       </w:r>
     </w:p>
   </w:comment>
-  <w:comment w:id="10" w:author="Style Manual Check" w:initials="SMC" w:date="2026-06-10T10:14:18Z">
+  <w:comment w:id="10" w:author="Style Manual Check" w:initials="SMC" w:date="2026-07-03T10:46:45Z">
     <w:p>
       <w:pPr>
         <w:pStyle w:val="CommentText"/>
@@ -736,7 +744,7 @@
       </w:r>
     </w:p>
   </w:comment>
-  <w:comment w:id="11" w:author="Style Manual Check" w:initials="SMC" w:date="2026-06-10T10:14:18Z">
+  <w:comment w:id="11" w:author="Style Manual Check" w:initials="SMC" w:date="2026-07-03T10:46:45Z">
     <w:p>
       <w:pPr>
         <w:pStyle w:val="CommentText"/>
@@ -794,7 +802,7 @@
       </w:r>
     </w:p>
   </w:comment>
-  <w:comment w:id="12" w:author="Style Manual Check" w:initials="SMC" w:date="2026-06-10T10:14:18Z">
+  <w:comment w:id="12" w:author="Style Manual Check" w:initials="SMC" w:date="2026-07-03T10:46:45Z">
     <w:p>
       <w:pPr>
         <w:pStyle w:val="CommentText"/>
@@ -820,7 +828,7 @@
       </w:r>
     </w:p>
   </w:comment>
-  <w:comment w:id="13" w:author="Style Manual Check" w:initials="SMC" w:date="2026-06-10T10:14:18Z">
+  <w:comment w:id="13" w:author="Style Manual Check" w:initials="SMC" w:date="2026-07-03T10:46:45Z">
     <w:p>
       <w:pPr>
         <w:pStyle w:val="CommentText"/>
@@ -846,7 +854,7 @@
       </w:r>
     </w:p>
   </w:comment>
-  <w:comment w:id="14" w:author="Style Manual Check" w:initials="SMC" w:date="2026-06-10T10:14:18Z">
+  <w:comment w:id="14" w:author="Style Manual Check" w:initials="SMC" w:date="2026-07-03T10:46:45Z">
     <w:p>
       <w:pPr>
         <w:pStyle w:val="CommentText"/>
@@ -872,7 +880,7 @@
       </w:r>
     </w:p>
   </w:comment>
-  <w:comment w:id="15" w:author="Style Manual Check" w:initials="SMC" w:date="2026-06-10T10:14:18Z">
+  <w:comment w:id="15" w:author="Style Manual Check" w:initials="SMC" w:date="2026-07-03T10:46:45Z">
     <w:p>
       <w:pPr>
         <w:pStyle w:val="CommentText"/>
@@ -898,7 +906,7 @@
       </w:r>
     </w:p>
   </w:comment>
-  <w:comment w:id="16" w:author="Style Manual Check" w:initials="SMC" w:date="2026-06-10T10:14:18Z">
+  <w:comment w:id="16" w:author="Style Manual Check" w:initials="SMC" w:date="2026-07-03T10:46:45Z">
     <w:p>
       <w:pPr>
         <w:pStyle w:val="CommentText"/>
@@ -924,7 +932,7 @@
       </w:r>
     </w:p>
   </w:comment>
-  <w:comment w:id="17" w:author="Style Manual Check" w:initials="SMC" w:date="2026-06-10T10:14:18Z">
+  <w:comment w:id="17" w:author="Style Manual Check" w:initials="SMC" w:date="2026-07-03T10:46:45Z">
     <w:p>
       <w:pPr>
         <w:pStyle w:val="CommentText"/>
@@ -990,7 +998,7 @@
       </w:r>
     </w:p>
   </w:comment>
-  <w:comment w:id="18" w:author="Style Manual Check" w:initials="SMC" w:date="2026-06-10T10:14:18Z">
+  <w:comment w:id="18" w:author="Style Manual Check" w:initials="SMC" w:date="2026-07-03T10:46:45Z">
     <w:p>
       <w:pPr>
         <w:pStyle w:val="CommentText"/>
@@ -1024,7 +1032,7 @@
       </w:r>
     </w:p>
   </w:comment>
-  <w:comment w:id="19" w:author="Style Manual Check" w:initials="SMC" w:date="2026-06-10T10:14:18Z">
+  <w:comment w:id="19" w:author="Style Manual Check" w:initials="SMC" w:date="2026-07-03T10:46:45Z">
     <w:p>
       <w:pPr>
         <w:pStyle w:val="CommentText"/>
@@ -1050,7 +1058,7 @@
       </w:r>
     </w:p>
   </w:comment>
-  <w:comment w:id="20" w:author="Style Manual Check" w:initials="SMC" w:date="2026-06-10T10:14:18Z">
+  <w:comment w:id="20" w:author="Style Manual Check" w:initials="SMC" w:date="2026-07-03T10:46:45Z">
     <w:p>
       <w:pPr>
         <w:pStyle w:val="CommentText"/>
@@ -1076,7 +1084,7 @@
       </w:r>
     </w:p>
   </w:comment>
-  <w:comment w:id="21" w:author="Style Manual Check" w:initials="SMC" w:date="2026-06-10T10:14:18Z">
+  <w:comment w:id="21" w:author="Style Manual Check" w:initials="SMC" w:date="2026-07-03T10:46:45Z">
     <w:p>
       <w:pPr>
         <w:pStyle w:val="CommentText"/>
@@ -1102,7 +1110,33 @@
       </w:r>
     </w:p>
   </w:comment>
-  <w:comment w:id="22" w:author="Style Manual Check" w:initials="SMC" w:date="2026-06-10T10:14:18Z">
+  <w:comment w:id="22" w:author="Style Manual Check" w:initials="SMC" w:date="2026-07-03T10:46:45Z">
+    <w:p>
+      <w:pPr>
+        <w:pStyle w:val="CommentText"/>
+      </w:pPr>
+      <w:r>
+        <w:t xml:space="preserve">Missing space before 'am' or 'pm': Separate the numerals and 'am' or 'pm' with a space (a non-breaking space in Word). Write '3 pm', not '3pm'.</w:t>
+      </w:r>
+    </w:p>
+    <w:p>
+      <w:pPr>
+        <w:pStyle w:val="CommentText"/>
+      </w:pPr>
+      <w:r>
+        <w:t xml:space="preserve">Suggested change: '3.30 pm'</w:t>
+      </w:r>
+    </w:p>
+    <w:p>
+      <w:pPr>
+        <w:pStyle w:val="CommentText"/>
+      </w:pPr>
+      <w:r>
+        <w:t xml:space="preserve">Style Manual guidance: https://www.stylemanual.gov.au/grammar-punctuation-and-conventions/numbers-and-measurements/dates-and-time</w:t>
+      </w:r>
+    </w:p>
+  </w:comment>
+  <w:comment w:id="23" w:author="Style Manual Check" w:initials="SMC" w:date="2026-07-03T10:46:45Z">
     <w:p>
       <w:pPr>
         <w:pStyle w:val="CommentText"/>
@@ -1128,7 +1162,7 @@
       </w:r>
     </w:p>
   </w:comment>
-  <w:comment w:id="23" w:author="Style Manual Check" w:initials="SMC" w:date="2026-06-10T10:14:18Z">
+  <w:comment w:id="24" w:author="Style Manual Check" w:initials="SMC" w:date="2026-07-03T10:46:45Z">
     <w:p>
       <w:pPr>
         <w:pStyle w:val="CommentText"/>

</xml_diff>

<commit_message>
Review fixes: copy, spinner, example masking, rule fixes
</commit_message>
<xml_diff>
--- a/tests/sample - annotated.docx
+++ b/tests/sample - annotated.docx
@@ -426,7 +426,7 @@
 
 <file path=word/comments.xml><?xml version="1.0" encoding="utf-8"?>
 <w:comments xmlns:w="http://schemas.openxmlformats.org/wordprocessingml/2006/main">
-  <w:comment w:id="0" w:author="Style Manual Check" w:initials="SMC" w:date="2026-07-03T10:46:45Z">
+  <w:comment w:id="0" w:author="Style Manual Check" w:initials="SMC" w:date="2026-07-04T13:14:19Z">
     <w:p>
       <w:pPr>
         <w:pStyle w:val="CommentText"/>
@@ -484,7 +484,7 @@
       </w:r>
     </w:p>
   </w:comment>
-  <w:comment w:id="1" w:author="Style Manual Check" w:initials="SMC" w:date="2026-07-03T10:46:45Z">
+  <w:comment w:id="1" w:author="Style Manual Check" w:initials="SMC" w:date="2026-07-04T13:14:19Z">
     <w:p>
       <w:pPr>
         <w:pStyle w:val="CommentText"/>
@@ -510,7 +510,7 @@
       </w:r>
     </w:p>
   </w:comment>
-  <w:comment w:id="2" w:author="Style Manual Check" w:initials="SMC" w:date="2026-07-03T10:46:45Z">
+  <w:comment w:id="2" w:author="Style Manual Check" w:initials="SMC" w:date="2026-07-04T13:14:19Z">
     <w:p>
       <w:pPr>
         <w:pStyle w:val="CommentText"/>
@@ -536,7 +536,7 @@
       </w:r>
     </w:p>
   </w:comment>
-  <w:comment w:id="3" w:author="Style Manual Check" w:initials="SMC" w:date="2026-07-03T10:46:45Z">
+  <w:comment w:id="3" w:author="Style Manual Check" w:initials="SMC" w:date="2026-07-04T13:14:19Z">
     <w:p>
       <w:pPr>
         <w:pStyle w:val="CommentText"/>
@@ -562,7 +562,7 @@
       </w:r>
     </w:p>
   </w:comment>
-  <w:comment w:id="4" w:author="Style Manual Check" w:initials="SMC" w:date="2026-07-03T10:46:45Z">
+  <w:comment w:id="4" w:author="Style Manual Check" w:initials="SMC" w:date="2026-07-04T13:14:19Z">
     <w:p>
       <w:pPr>
         <w:pStyle w:val="CommentText"/>
@@ -588,7 +588,7 @@
       </w:r>
     </w:p>
   </w:comment>
-  <w:comment w:id="5" w:author="Style Manual Check" w:initials="SMC" w:date="2026-07-03T10:46:45Z">
+  <w:comment w:id="5" w:author="Style Manual Check" w:initials="SMC" w:date="2026-07-04T13:14:19Z">
     <w:p>
       <w:pPr>
         <w:pStyle w:val="CommentText"/>
@@ -614,7 +614,7 @@
       </w:r>
     </w:p>
   </w:comment>
-  <w:comment w:id="6" w:author="Style Manual Check" w:initials="SMC" w:date="2026-07-03T10:46:45Z">
+  <w:comment w:id="6" w:author="Style Manual Check" w:initials="SMC" w:date="2026-07-04T13:14:19Z">
     <w:p>
       <w:pPr>
         <w:pStyle w:val="CommentText"/>
@@ -640,7 +640,7 @@
       </w:r>
     </w:p>
   </w:comment>
-  <w:comment w:id="7" w:author="Style Manual Check" w:initials="SMC" w:date="2026-07-03T10:46:45Z">
+  <w:comment w:id="7" w:author="Style Manual Check" w:initials="SMC" w:date="2026-07-04T13:14:19Z">
     <w:p>
       <w:pPr>
         <w:pStyle w:val="CommentText"/>
@@ -666,7 +666,7 @@
       </w:r>
     </w:p>
   </w:comment>
-  <w:comment w:id="8" w:author="Style Manual Check" w:initials="SMC" w:date="2026-07-03T10:46:45Z">
+  <w:comment w:id="8" w:author="Style Manual Check" w:initials="SMC" w:date="2026-07-04T13:14:19Z">
     <w:p>
       <w:pPr>
         <w:pStyle w:val="CommentText"/>
@@ -692,7 +692,7 @@
       </w:r>
     </w:p>
   </w:comment>
-  <w:comment w:id="9" w:author="Style Manual Check" w:initials="SMC" w:date="2026-07-03T10:46:45Z">
+  <w:comment w:id="9" w:author="Style Manual Check" w:initials="SMC" w:date="2026-07-04T13:14:19Z">
     <w:p>
       <w:pPr>
         <w:pStyle w:val="CommentText"/>
@@ -718,7 +718,7 @@
       </w:r>
     </w:p>
   </w:comment>
-  <w:comment w:id="10" w:author="Style Manual Check" w:initials="SMC" w:date="2026-07-03T10:46:45Z">
+  <w:comment w:id="10" w:author="Style Manual Check" w:initials="SMC" w:date="2026-07-04T13:14:19Z">
     <w:p>
       <w:pPr>
         <w:pStyle w:val="CommentText"/>
@@ -744,7 +744,7 @@
       </w:r>
     </w:p>
   </w:comment>
-  <w:comment w:id="11" w:author="Style Manual Check" w:initials="SMC" w:date="2026-07-03T10:46:45Z">
+  <w:comment w:id="11" w:author="Style Manual Check" w:initials="SMC" w:date="2026-07-04T13:14:19Z">
     <w:p>
       <w:pPr>
         <w:pStyle w:val="CommentText"/>
@@ -802,7 +802,7 @@
       </w:r>
     </w:p>
   </w:comment>
-  <w:comment w:id="12" w:author="Style Manual Check" w:initials="SMC" w:date="2026-07-03T10:46:45Z">
+  <w:comment w:id="12" w:author="Style Manual Check" w:initials="SMC" w:date="2026-07-04T13:14:19Z">
     <w:p>
       <w:pPr>
         <w:pStyle w:val="CommentText"/>
@@ -828,7 +828,7 @@
       </w:r>
     </w:p>
   </w:comment>
-  <w:comment w:id="13" w:author="Style Manual Check" w:initials="SMC" w:date="2026-07-03T10:46:45Z">
+  <w:comment w:id="13" w:author="Style Manual Check" w:initials="SMC" w:date="2026-07-04T13:14:19Z">
     <w:p>
       <w:pPr>
         <w:pStyle w:val="CommentText"/>
@@ -854,7 +854,7 @@
       </w:r>
     </w:p>
   </w:comment>
-  <w:comment w:id="14" w:author="Style Manual Check" w:initials="SMC" w:date="2026-07-03T10:46:45Z">
+  <w:comment w:id="14" w:author="Style Manual Check" w:initials="SMC" w:date="2026-07-04T13:14:19Z">
     <w:p>
       <w:pPr>
         <w:pStyle w:val="CommentText"/>
@@ -880,7 +880,7 @@
       </w:r>
     </w:p>
   </w:comment>
-  <w:comment w:id="15" w:author="Style Manual Check" w:initials="SMC" w:date="2026-07-03T10:46:45Z">
+  <w:comment w:id="15" w:author="Style Manual Check" w:initials="SMC" w:date="2026-07-04T13:14:19Z">
     <w:p>
       <w:pPr>
         <w:pStyle w:val="CommentText"/>
@@ -906,7 +906,7 @@
       </w:r>
     </w:p>
   </w:comment>
-  <w:comment w:id="16" w:author="Style Manual Check" w:initials="SMC" w:date="2026-07-03T10:46:45Z">
+  <w:comment w:id="16" w:author="Style Manual Check" w:initials="SMC" w:date="2026-07-04T13:14:19Z">
     <w:p>
       <w:pPr>
         <w:pStyle w:val="CommentText"/>
@@ -932,7 +932,7 @@
       </w:r>
     </w:p>
   </w:comment>
-  <w:comment w:id="17" w:author="Style Manual Check" w:initials="SMC" w:date="2026-07-03T10:46:45Z">
+  <w:comment w:id="17" w:author="Style Manual Check" w:initials="SMC" w:date="2026-07-04T13:14:19Z">
     <w:p>
       <w:pPr>
         <w:pStyle w:val="CommentText"/>
@@ -998,7 +998,7 @@
       </w:r>
     </w:p>
   </w:comment>
-  <w:comment w:id="18" w:author="Style Manual Check" w:initials="SMC" w:date="2026-07-03T10:46:45Z">
+  <w:comment w:id="18" w:author="Style Manual Check" w:initials="SMC" w:date="2026-07-04T13:14:19Z">
     <w:p>
       <w:pPr>
         <w:pStyle w:val="CommentText"/>
@@ -1032,7 +1032,7 @@
       </w:r>
     </w:p>
   </w:comment>
-  <w:comment w:id="19" w:author="Style Manual Check" w:initials="SMC" w:date="2026-07-03T10:46:45Z">
+  <w:comment w:id="19" w:author="Style Manual Check" w:initials="SMC" w:date="2026-07-04T13:14:19Z">
     <w:p>
       <w:pPr>
         <w:pStyle w:val="CommentText"/>
@@ -1058,7 +1058,7 @@
       </w:r>
     </w:p>
   </w:comment>
-  <w:comment w:id="20" w:author="Style Manual Check" w:initials="SMC" w:date="2026-07-03T10:46:45Z">
+  <w:comment w:id="20" w:author="Style Manual Check" w:initials="SMC" w:date="2026-07-04T13:14:19Z">
     <w:p>
       <w:pPr>
         <w:pStyle w:val="CommentText"/>
@@ -1084,7 +1084,7 @@
       </w:r>
     </w:p>
   </w:comment>
-  <w:comment w:id="21" w:author="Style Manual Check" w:initials="SMC" w:date="2026-07-03T10:46:45Z">
+  <w:comment w:id="21" w:author="Style Manual Check" w:initials="SMC" w:date="2026-07-04T13:14:19Z">
     <w:p>
       <w:pPr>
         <w:pStyle w:val="CommentText"/>
@@ -1110,7 +1110,7 @@
       </w:r>
     </w:p>
   </w:comment>
-  <w:comment w:id="22" w:author="Style Manual Check" w:initials="SMC" w:date="2026-07-03T10:46:45Z">
+  <w:comment w:id="22" w:author="Style Manual Check" w:initials="SMC" w:date="2026-07-04T13:14:19Z">
     <w:p>
       <w:pPr>
         <w:pStyle w:val="CommentText"/>
@@ -1136,7 +1136,7 @@
       </w:r>
     </w:p>
   </w:comment>
-  <w:comment w:id="23" w:author="Style Manual Check" w:initials="SMC" w:date="2026-07-03T10:46:45Z">
+  <w:comment w:id="23" w:author="Style Manual Check" w:initials="SMC" w:date="2026-07-04T13:14:19Z">
     <w:p>
       <w:pPr>
         <w:pStyle w:val="CommentText"/>
@@ -1162,7 +1162,7 @@
       </w:r>
     </w:p>
   </w:comment>
-  <w:comment w:id="24" w:author="Style Manual Check" w:initials="SMC" w:date="2026-07-03T10:46:45Z">
+  <w:comment w:id="24" w:author="Style Manual Check" w:initials="SMC" w:date="2026-07-04T13:14:19Z">
     <w:p>
       <w:pPr>
         <w:pStyle w:val="CommentText"/>

</xml_diff>

<commit_message>
Refresh test output artifact from npm test
Co-Authored-By: Claude Fable 5 <noreply@anthropic.com>
</commit_message>
<xml_diff>
--- a/tests/sample - annotated.docx
+++ b/tests/sample - annotated.docx
@@ -386,8 +386,19 @@
             <w:tcW w:type="dxa" w:w="4320"/>
           </w:tcPr>
           <w:p>
+            <w:commentRangeStart w:id="24"/>
             <w:r>
-              <w:t>Colorful data</w:t>
+              <w:t xml:space="preserve">Colorful</w:t>
+            </w:r>
+            <w:commentRangeEnd w:id="24"/>
+            <w:r>
+              <w:rPr>
+                <w:rStyle w:val="CommentReference"/>
+              </w:rPr>
+              <w:commentReference w:id="24"/>
+            </w:r>
+            <w:r>
+              <w:t xml:space="preserve"> data</w:t>
             </w:r>
           </w:p>
         </w:tc>
@@ -396,16 +407,16 @@
             <w:tcW w:type="dxa" w:w="4320"/>
           </w:tcPr>
           <w:p>
-            <w:commentRangeStart w:id="24"/>
+            <w:commentRangeStart w:id="25"/>
             <w:r>
               <w:t xml:space="preserve">Approx.</w:t>
             </w:r>
-            <w:commentRangeEnd w:id="24"/>
+            <w:commentRangeEnd w:id="25"/>
             <w:r>
               <w:rPr>
                 <w:rStyle w:val="CommentReference"/>
               </w:rPr>
-              <w:commentReference w:id="24"/>
+              <w:commentReference w:id="25"/>
             </w:r>
             <w:r>
               <w:t xml:space="preserve"> 100 items</w:t>
@@ -426,7 +437,7 @@
 
 <file path=word/comments.xml><?xml version="1.0" encoding="utf-8"?>
 <w:comments xmlns:w="http://schemas.openxmlformats.org/wordprocessingml/2006/main">
-  <w:comment w:id="0" w:author="Style Manual Check" w:initials="SMC" w:date="2026-07-04T13:14:19Z">
+  <w:comment w:id="0" w:author="Style Manual Check" w:initials="SMC" w:date="2026-07-15T08:13:41Z">
     <w:p>
       <w:pPr>
         <w:pStyle w:val="CommentText"/>
@@ -472,7 +483,15 @@
         <w:pStyle w:val="CommentText"/>
       </w:pPr>
       <w:r>
-        <w:t xml:space="preserve">Suggested change: 'Colour'</w:t>
+        <w:t xml:space="preserve">Suggested change: Colour</w:t>
+      </w:r>
+    </w:p>
+    <w:p>
+      <w:pPr>
+        <w:pStyle w:val="CommentText"/>
+      </w:pPr>
+      <w:r>
+        <w:t xml:space="preserve">Names and titles keep their original spelling. If this is not part of a name, use the Australian spelling.</w:t>
       </w:r>
     </w:p>
     <w:p>
@@ -484,7 +503,7 @@
       </w:r>
     </w:p>
   </w:comment>
-  <w:comment w:id="1" w:author="Style Manual Check" w:initials="SMC" w:date="2026-07-04T13:14:19Z">
+  <w:comment w:id="1" w:author="Style Manual Check" w:initials="SMC" w:date="2026-07-15T08:13:41Z">
     <w:p>
       <w:pPr>
         <w:pStyle w:val="CommentText"/>
@@ -498,7 +517,7 @@
         <w:pStyle w:val="CommentText"/>
       </w:pPr>
       <w:r>
-        <w:t xml:space="preserve">Suggested change: '15 January 2024'</w:t>
+        <w:t xml:space="preserve">Suggested change: '15 January 2024'</w:t>
       </w:r>
     </w:p>
     <w:p>
@@ -510,7 +529,7 @@
       </w:r>
     </w:p>
   </w:comment>
-  <w:comment w:id="2" w:author="Style Manual Check" w:initials="SMC" w:date="2026-07-04T13:14:19Z">
+  <w:comment w:id="2" w:author="Style Manual Check" w:initials="SMC" w:date="2026-07-15T08:13:41Z">
     <w:p>
       <w:pPr>
         <w:pStyle w:val="CommentText"/>
@@ -536,7 +555,7 @@
       </w:r>
     </w:p>
   </w:comment>
-  <w:comment w:id="3" w:author="Style Manual Check" w:initials="SMC" w:date="2026-07-04T13:14:19Z">
+  <w:comment w:id="3" w:author="Style Manual Check" w:initials="SMC" w:date="2026-07-15T08:13:41Z">
     <w:p>
       <w:pPr>
         <w:pStyle w:val="CommentText"/>
@@ -562,7 +581,7 @@
       </w:r>
     </w:p>
   </w:comment>
-  <w:comment w:id="4" w:author="Style Manual Check" w:initials="SMC" w:date="2026-07-04T13:14:19Z">
+  <w:comment w:id="4" w:author="Style Manual Check" w:initials="SMC" w:date="2026-07-15T08:13:41Z">
     <w:p>
       <w:pPr>
         <w:pStyle w:val="CommentText"/>
@@ -588,7 +607,7 @@
       </w:r>
     </w:p>
   </w:comment>
-  <w:comment w:id="5" w:author="Style Manual Check" w:initials="SMC" w:date="2026-07-04T13:14:19Z">
+  <w:comment w:id="5" w:author="Style Manual Check" w:initials="SMC" w:date="2026-07-15T08:13:41Z">
     <w:p>
       <w:pPr>
         <w:pStyle w:val="CommentText"/>
@@ -614,7 +633,7 @@
       </w:r>
     </w:p>
   </w:comment>
-  <w:comment w:id="6" w:author="Style Manual Check" w:initials="SMC" w:date="2026-07-04T13:14:19Z">
+  <w:comment w:id="6" w:author="Style Manual Check" w:initials="SMC" w:date="2026-07-15T08:13:41Z">
     <w:p>
       <w:pPr>
         <w:pStyle w:val="CommentText"/>
@@ -640,7 +659,7 @@
       </w:r>
     </w:p>
   </w:comment>
-  <w:comment w:id="7" w:author="Style Manual Check" w:initials="SMC" w:date="2026-07-04T13:14:19Z">
+  <w:comment w:id="7" w:author="Style Manual Check" w:initials="SMC" w:date="2026-07-15T08:13:41Z">
     <w:p>
       <w:pPr>
         <w:pStyle w:val="CommentText"/>
@@ -666,7 +685,7 @@
       </w:r>
     </w:p>
   </w:comment>
-  <w:comment w:id="8" w:author="Style Manual Check" w:initials="SMC" w:date="2026-07-04T13:14:19Z">
+  <w:comment w:id="8" w:author="Style Manual Check" w:initials="SMC" w:date="2026-07-15T08:13:41Z">
     <w:p>
       <w:pPr>
         <w:pStyle w:val="CommentText"/>
@@ -692,7 +711,7 @@
       </w:r>
     </w:p>
   </w:comment>
-  <w:comment w:id="9" w:author="Style Manual Check" w:initials="SMC" w:date="2026-07-04T13:14:19Z">
+  <w:comment w:id="9" w:author="Style Manual Check" w:initials="SMC" w:date="2026-07-15T08:13:41Z">
     <w:p>
       <w:pPr>
         <w:pStyle w:val="CommentText"/>
@@ -718,7 +737,7 @@
       </w:r>
     </w:p>
   </w:comment>
-  <w:comment w:id="10" w:author="Style Manual Check" w:initials="SMC" w:date="2026-07-04T13:14:19Z">
+  <w:comment w:id="10" w:author="Style Manual Check" w:initials="SMC" w:date="2026-07-15T08:13:41Z">
     <w:p>
       <w:pPr>
         <w:pStyle w:val="CommentText"/>
@@ -744,7 +763,7 @@
       </w:r>
     </w:p>
   </w:comment>
-  <w:comment w:id="11" w:author="Style Manual Check" w:initials="SMC" w:date="2026-07-04T13:14:19Z">
+  <w:comment w:id="11" w:author="Style Manual Check" w:initials="SMC" w:date="2026-07-15T08:13:41Z">
     <w:p>
       <w:pPr>
         <w:pStyle w:val="CommentText"/>
@@ -802,7 +821,7 @@
       </w:r>
     </w:p>
   </w:comment>
-  <w:comment w:id="12" w:author="Style Manual Check" w:initials="SMC" w:date="2026-07-04T13:14:19Z">
+  <w:comment w:id="12" w:author="Style Manual Check" w:initials="SMC" w:date="2026-07-15T08:13:41Z">
     <w:p>
       <w:pPr>
         <w:pStyle w:val="CommentText"/>
@@ -828,7 +847,7 @@
       </w:r>
     </w:p>
   </w:comment>
-  <w:comment w:id="13" w:author="Style Manual Check" w:initials="SMC" w:date="2026-07-04T13:14:19Z">
+  <w:comment w:id="13" w:author="Style Manual Check" w:initials="SMC" w:date="2026-07-15T08:13:41Z">
     <w:p>
       <w:pPr>
         <w:pStyle w:val="CommentText"/>
@@ -854,7 +873,7 @@
       </w:r>
     </w:p>
   </w:comment>
-  <w:comment w:id="14" w:author="Style Manual Check" w:initials="SMC" w:date="2026-07-04T13:14:19Z">
+  <w:comment w:id="14" w:author="Style Manual Check" w:initials="SMC" w:date="2026-07-15T08:13:41Z">
     <w:p>
       <w:pPr>
         <w:pStyle w:val="CommentText"/>
@@ -880,7 +899,7 @@
       </w:r>
     </w:p>
   </w:comment>
-  <w:comment w:id="15" w:author="Style Manual Check" w:initials="SMC" w:date="2026-07-04T13:14:19Z">
+  <w:comment w:id="15" w:author="Style Manual Check" w:initials="SMC" w:date="2026-07-15T08:13:41Z">
     <w:p>
       <w:pPr>
         <w:pStyle w:val="CommentText"/>
@@ -906,7 +925,7 @@
       </w:r>
     </w:p>
   </w:comment>
-  <w:comment w:id="16" w:author="Style Manual Check" w:initials="SMC" w:date="2026-07-04T13:14:19Z">
+  <w:comment w:id="16" w:author="Style Manual Check" w:initials="SMC" w:date="2026-07-15T08:13:41Z">
     <w:p>
       <w:pPr>
         <w:pStyle w:val="CommentText"/>
@@ -932,7 +951,7 @@
       </w:r>
     </w:p>
   </w:comment>
-  <w:comment w:id="17" w:author="Style Manual Check" w:initials="SMC" w:date="2026-07-04T13:14:19Z">
+  <w:comment w:id="17" w:author="Style Manual Check" w:initials="SMC" w:date="2026-07-15T08:13:41Z">
     <w:p>
       <w:pPr>
         <w:pStyle w:val="CommentText"/>
@@ -998,7 +1017,7 @@
       </w:r>
     </w:p>
   </w:comment>
-  <w:comment w:id="18" w:author="Style Manual Check" w:initials="SMC" w:date="2026-07-04T13:14:19Z">
+  <w:comment w:id="18" w:author="Style Manual Check" w:initials="SMC" w:date="2026-07-15T08:13:41Z">
     <w:p>
       <w:pPr>
         <w:pStyle w:val="CommentText"/>
@@ -1032,7 +1051,7 @@
       </w:r>
     </w:p>
   </w:comment>
-  <w:comment w:id="19" w:author="Style Manual Check" w:initials="SMC" w:date="2026-07-04T13:14:19Z">
+  <w:comment w:id="19" w:author="Style Manual Check" w:initials="SMC" w:date="2026-07-15T08:13:41Z">
     <w:p>
       <w:pPr>
         <w:pStyle w:val="CommentText"/>
@@ -1058,7 +1077,7 @@
       </w:r>
     </w:p>
   </w:comment>
-  <w:comment w:id="20" w:author="Style Manual Check" w:initials="SMC" w:date="2026-07-04T13:14:19Z">
+  <w:comment w:id="20" w:author="Style Manual Check" w:initials="SMC" w:date="2026-07-15T08:13:41Z">
     <w:p>
       <w:pPr>
         <w:pStyle w:val="CommentText"/>
@@ -1084,7 +1103,7 @@
       </w:r>
     </w:p>
   </w:comment>
-  <w:comment w:id="21" w:author="Style Manual Check" w:initials="SMC" w:date="2026-07-04T13:14:19Z">
+  <w:comment w:id="21" w:author="Style Manual Check" w:initials="SMC" w:date="2026-07-15T08:13:41Z">
     <w:p>
       <w:pPr>
         <w:pStyle w:val="CommentText"/>
@@ -1110,7 +1129,7 @@
       </w:r>
     </w:p>
   </w:comment>
-  <w:comment w:id="22" w:author="Style Manual Check" w:initials="SMC" w:date="2026-07-04T13:14:19Z">
+  <w:comment w:id="22" w:author="Style Manual Check" w:initials="SMC" w:date="2026-07-15T08:13:41Z">
     <w:p>
       <w:pPr>
         <w:pStyle w:val="CommentText"/>
@@ -1124,7 +1143,7 @@
         <w:pStyle w:val="CommentText"/>
       </w:pPr>
       <w:r>
-        <w:t xml:space="preserve">Suggested change: '3.30 pm'</w:t>
+        <w:t xml:space="preserve">Suggested change: '3.30 pm'</w:t>
       </w:r>
     </w:p>
     <w:p>
@@ -1136,7 +1155,7 @@
       </w:r>
     </w:p>
   </w:comment>
-  <w:comment w:id="23" w:author="Style Manual Check" w:initials="SMC" w:date="2026-07-04T13:14:19Z">
+  <w:comment w:id="23" w:author="Style Manual Check" w:initials="SMC" w:date="2026-07-15T08:13:41Z">
     <w:p>
       <w:pPr>
         <w:pStyle w:val="CommentText"/>
@@ -1162,7 +1181,33 @@
       </w:r>
     </w:p>
   </w:comment>
-  <w:comment w:id="24" w:author="Style Manual Check" w:initials="SMC" w:date="2026-07-04T13:14:19Z">
+  <w:comment w:id="24" w:author="Style Manual Check" w:initials="SMC" w:date="2026-07-15T08:13:41Z">
+    <w:p>
+      <w:pPr>
+        <w:pStyle w:val="CommentText"/>
+      </w:pPr>
+      <w:r>
+        <w:t xml:space="preserve">-or to -our spelling: Australian English uses -our endings (for example, colour, favour, honour).</w:t>
+      </w:r>
+    </w:p>
+    <w:p>
+      <w:pPr>
+        <w:pStyle w:val="CommentText"/>
+      </w:pPr>
+      <w:r>
+        <w:t xml:space="preserve">Suggested change: 'Colourful'</w:t>
+      </w:r>
+    </w:p>
+    <w:p>
+      <w:pPr>
+        <w:pStyle w:val="CommentText"/>
+      </w:pPr>
+      <w:r>
+        <w:t xml:space="preserve">Style Manual guidance: https://www.stylemanual.gov.au/grammar-punctuation-and-conventions/spelling</w:t>
+      </w:r>
+    </w:p>
+  </w:comment>
+  <w:comment w:id="25" w:author="Style Manual Check" w:initials="SMC" w:date="2026-07-15T08:13:41Z">
     <w:p>
       <w:pPr>
         <w:pStyle w:val="CommentText"/>
@@ -1176,7 +1221,7 @@
         <w:pStyle w:val="CommentText"/>
       </w:pPr>
       <w:r>
-        <w:t xml:space="preserve">Suggested change: 'Approx'</w:t>
+        <w:t xml:space="preserve">Suggested change: 'Approximately'</w:t>
       </w:r>
     </w:p>
     <w:p>

</xml_diff>

<commit_message>
Fix am/pm sentence-stop false positive; latin fixes keep the comma
time-ampm-case no longer flags a correct lowercase 'pm.' at the end
of a sentence, and no longer deletes the sentence full stop when a
wrong-case marker ends the text. latin-ie now always replaces with
'that is,' (latin-eg already included the comma). About page: sample
briefing mention on the Check a document card; footer wording matches
the Check page.

Co-Authored-By: Claude Fable 5 <noreply@anthropic.com>
</commit_message>
<xml_diff>
--- a/tests/sample - annotated.docx
+++ b/tests/sample - annotated.docx
@@ -437,7 +437,7 @@
 
 <file path=word/comments.xml><?xml version="1.0" encoding="utf-8"?>
 <w:comments xmlns:w="http://schemas.openxmlformats.org/wordprocessingml/2006/main">
-  <w:comment w:id="0" w:author="Style Manual Check" w:initials="SMC" w:date="2026-07-15T08:13:41Z">
+  <w:comment w:id="0" w:author="Style Manual Check" w:initials="SMC" w:date="2026-07-17T06:52:21Z">
     <w:p>
       <w:pPr>
         <w:pStyle w:val="CommentText"/>
@@ -503,7 +503,7 @@
       </w:r>
     </w:p>
   </w:comment>
-  <w:comment w:id="1" w:author="Style Manual Check" w:initials="SMC" w:date="2026-07-15T08:13:41Z">
+  <w:comment w:id="1" w:author="Style Manual Check" w:initials="SMC" w:date="2026-07-17T06:52:21Z">
     <w:p>
       <w:pPr>
         <w:pStyle w:val="CommentText"/>
@@ -529,7 +529,7 @@
       </w:r>
     </w:p>
   </w:comment>
-  <w:comment w:id="2" w:author="Style Manual Check" w:initials="SMC" w:date="2026-07-15T08:13:41Z">
+  <w:comment w:id="2" w:author="Style Manual Check" w:initials="SMC" w:date="2026-07-17T06:52:21Z">
     <w:p>
       <w:pPr>
         <w:pStyle w:val="CommentText"/>
@@ -555,7 +555,7 @@
       </w:r>
     </w:p>
   </w:comment>
-  <w:comment w:id="3" w:author="Style Manual Check" w:initials="SMC" w:date="2026-07-15T08:13:41Z">
+  <w:comment w:id="3" w:author="Style Manual Check" w:initials="SMC" w:date="2026-07-17T06:52:21Z">
     <w:p>
       <w:pPr>
         <w:pStyle w:val="CommentText"/>
@@ -581,7 +581,7 @@
       </w:r>
     </w:p>
   </w:comment>
-  <w:comment w:id="4" w:author="Style Manual Check" w:initials="SMC" w:date="2026-07-15T08:13:41Z">
+  <w:comment w:id="4" w:author="Style Manual Check" w:initials="SMC" w:date="2026-07-17T06:52:21Z">
     <w:p>
       <w:pPr>
         <w:pStyle w:val="CommentText"/>
@@ -607,7 +607,7 @@
       </w:r>
     </w:p>
   </w:comment>
-  <w:comment w:id="5" w:author="Style Manual Check" w:initials="SMC" w:date="2026-07-15T08:13:41Z">
+  <w:comment w:id="5" w:author="Style Manual Check" w:initials="SMC" w:date="2026-07-17T06:52:21Z">
     <w:p>
       <w:pPr>
         <w:pStyle w:val="CommentText"/>
@@ -633,7 +633,7 @@
       </w:r>
     </w:p>
   </w:comment>
-  <w:comment w:id="6" w:author="Style Manual Check" w:initials="SMC" w:date="2026-07-15T08:13:41Z">
+  <w:comment w:id="6" w:author="Style Manual Check" w:initials="SMC" w:date="2026-07-17T06:52:21Z">
     <w:p>
       <w:pPr>
         <w:pStyle w:val="CommentText"/>
@@ -659,7 +659,7 @@
       </w:r>
     </w:p>
   </w:comment>
-  <w:comment w:id="7" w:author="Style Manual Check" w:initials="SMC" w:date="2026-07-15T08:13:41Z">
+  <w:comment w:id="7" w:author="Style Manual Check" w:initials="SMC" w:date="2026-07-17T06:52:21Z">
     <w:p>
       <w:pPr>
         <w:pStyle w:val="CommentText"/>
@@ -685,7 +685,7 @@
       </w:r>
     </w:p>
   </w:comment>
-  <w:comment w:id="8" w:author="Style Manual Check" w:initials="SMC" w:date="2026-07-15T08:13:41Z">
+  <w:comment w:id="8" w:author="Style Manual Check" w:initials="SMC" w:date="2026-07-17T06:52:21Z">
     <w:p>
       <w:pPr>
         <w:pStyle w:val="CommentText"/>
@@ -711,7 +711,7 @@
       </w:r>
     </w:p>
   </w:comment>
-  <w:comment w:id="9" w:author="Style Manual Check" w:initials="SMC" w:date="2026-07-15T08:13:41Z">
+  <w:comment w:id="9" w:author="Style Manual Check" w:initials="SMC" w:date="2026-07-17T06:52:21Z">
     <w:p>
       <w:pPr>
         <w:pStyle w:val="CommentText"/>
@@ -737,7 +737,7 @@
       </w:r>
     </w:p>
   </w:comment>
-  <w:comment w:id="10" w:author="Style Manual Check" w:initials="SMC" w:date="2026-07-15T08:13:41Z">
+  <w:comment w:id="10" w:author="Style Manual Check" w:initials="SMC" w:date="2026-07-17T06:52:21Z">
     <w:p>
       <w:pPr>
         <w:pStyle w:val="CommentText"/>
@@ -763,7 +763,7 @@
       </w:r>
     </w:p>
   </w:comment>
-  <w:comment w:id="11" w:author="Style Manual Check" w:initials="SMC" w:date="2026-07-15T08:13:41Z">
+  <w:comment w:id="11" w:author="Style Manual Check" w:initials="SMC" w:date="2026-07-17T06:52:21Z">
     <w:p>
       <w:pPr>
         <w:pStyle w:val="CommentText"/>
@@ -821,7 +821,7 @@
       </w:r>
     </w:p>
   </w:comment>
-  <w:comment w:id="12" w:author="Style Manual Check" w:initials="SMC" w:date="2026-07-15T08:13:41Z">
+  <w:comment w:id="12" w:author="Style Manual Check" w:initials="SMC" w:date="2026-07-17T06:52:21Z">
     <w:p>
       <w:pPr>
         <w:pStyle w:val="CommentText"/>
@@ -847,7 +847,7 @@
       </w:r>
     </w:p>
   </w:comment>
-  <w:comment w:id="13" w:author="Style Manual Check" w:initials="SMC" w:date="2026-07-15T08:13:41Z">
+  <w:comment w:id="13" w:author="Style Manual Check" w:initials="SMC" w:date="2026-07-17T06:52:21Z">
     <w:p>
       <w:pPr>
         <w:pStyle w:val="CommentText"/>
@@ -873,7 +873,7 @@
       </w:r>
     </w:p>
   </w:comment>
-  <w:comment w:id="14" w:author="Style Manual Check" w:initials="SMC" w:date="2026-07-15T08:13:41Z">
+  <w:comment w:id="14" w:author="Style Manual Check" w:initials="SMC" w:date="2026-07-17T06:52:21Z">
     <w:p>
       <w:pPr>
         <w:pStyle w:val="CommentText"/>
@@ -899,7 +899,7 @@
       </w:r>
     </w:p>
   </w:comment>
-  <w:comment w:id="15" w:author="Style Manual Check" w:initials="SMC" w:date="2026-07-15T08:13:41Z">
+  <w:comment w:id="15" w:author="Style Manual Check" w:initials="SMC" w:date="2026-07-17T06:52:21Z">
     <w:p>
       <w:pPr>
         <w:pStyle w:val="CommentText"/>
@@ -925,7 +925,7 @@
       </w:r>
     </w:p>
   </w:comment>
-  <w:comment w:id="16" w:author="Style Manual Check" w:initials="SMC" w:date="2026-07-15T08:13:41Z">
+  <w:comment w:id="16" w:author="Style Manual Check" w:initials="SMC" w:date="2026-07-17T06:52:21Z">
     <w:p>
       <w:pPr>
         <w:pStyle w:val="CommentText"/>
@@ -951,7 +951,7 @@
       </w:r>
     </w:p>
   </w:comment>
-  <w:comment w:id="17" w:author="Style Manual Check" w:initials="SMC" w:date="2026-07-15T08:13:41Z">
+  <w:comment w:id="17" w:author="Style Manual Check" w:initials="SMC" w:date="2026-07-17T06:52:21Z">
     <w:p>
       <w:pPr>
         <w:pStyle w:val="CommentText"/>
@@ -1017,7 +1017,7 @@
       </w:r>
     </w:p>
   </w:comment>
-  <w:comment w:id="18" w:author="Style Manual Check" w:initials="SMC" w:date="2026-07-15T08:13:41Z">
+  <w:comment w:id="18" w:author="Style Manual Check" w:initials="SMC" w:date="2026-07-17T06:52:21Z">
     <w:p>
       <w:pPr>
         <w:pStyle w:val="CommentText"/>
@@ -1051,7 +1051,7 @@
       </w:r>
     </w:p>
   </w:comment>
-  <w:comment w:id="19" w:author="Style Manual Check" w:initials="SMC" w:date="2026-07-15T08:13:41Z">
+  <w:comment w:id="19" w:author="Style Manual Check" w:initials="SMC" w:date="2026-07-17T06:52:21Z">
     <w:p>
       <w:pPr>
         <w:pStyle w:val="CommentText"/>
@@ -1077,7 +1077,7 @@
       </w:r>
     </w:p>
   </w:comment>
-  <w:comment w:id="20" w:author="Style Manual Check" w:initials="SMC" w:date="2026-07-15T08:13:41Z">
+  <w:comment w:id="20" w:author="Style Manual Check" w:initials="SMC" w:date="2026-07-17T06:52:21Z">
     <w:p>
       <w:pPr>
         <w:pStyle w:val="CommentText"/>
@@ -1103,7 +1103,7 @@
       </w:r>
     </w:p>
   </w:comment>
-  <w:comment w:id="21" w:author="Style Manual Check" w:initials="SMC" w:date="2026-07-15T08:13:41Z">
+  <w:comment w:id="21" w:author="Style Manual Check" w:initials="SMC" w:date="2026-07-17T06:52:21Z">
     <w:p>
       <w:pPr>
         <w:pStyle w:val="CommentText"/>
@@ -1129,7 +1129,7 @@
       </w:r>
     </w:p>
   </w:comment>
-  <w:comment w:id="22" w:author="Style Manual Check" w:initials="SMC" w:date="2026-07-15T08:13:41Z">
+  <w:comment w:id="22" w:author="Style Manual Check" w:initials="SMC" w:date="2026-07-17T06:52:21Z">
     <w:p>
       <w:pPr>
         <w:pStyle w:val="CommentText"/>
@@ -1155,7 +1155,7 @@
       </w:r>
     </w:p>
   </w:comment>
-  <w:comment w:id="23" w:author="Style Manual Check" w:initials="SMC" w:date="2026-07-15T08:13:41Z">
+  <w:comment w:id="23" w:author="Style Manual Check" w:initials="SMC" w:date="2026-07-17T06:52:21Z">
     <w:p>
       <w:pPr>
         <w:pStyle w:val="CommentText"/>
@@ -1181,7 +1181,7 @@
       </w:r>
     </w:p>
   </w:comment>
-  <w:comment w:id="24" w:author="Style Manual Check" w:initials="SMC" w:date="2026-07-15T08:13:41Z">
+  <w:comment w:id="24" w:author="Style Manual Check" w:initials="SMC" w:date="2026-07-17T06:52:21Z">
     <w:p>
       <w:pPr>
         <w:pStyle w:val="CommentText"/>
@@ -1207,7 +1207,7 @@
       </w:r>
     </w:p>
   </w:comment>
-  <w:comment w:id="25" w:author="Style Manual Check" w:initials="SMC" w:date="2026-07-15T08:13:41Z">
+  <w:comment w:id="25" w:author="Style Manual Check" w:initials="SMC" w:date="2026-07-17T06:52:21Z">
     <w:p>
       <w:pPr>
         <w:pStyle w:val="CommentText"/>

</xml_diff>

<commit_message>
Spelling and abbreviation false positives; e.g. double-fix bug
Retire punct-eg-ie-comma: latin-eg/latin-ie already rewrite every
e.g./i.e. (with the comma), and the two rules composing in the
tracked-changes download turned 'e.g.,' into 'for example' with no
comma. The annotator also gains a same-claim guard so two rules
matching identical text can never both apply.

Remove US spellings that are correct Australian words in their most
common sense: draft, draftsman, curb, tire (and dormant check, jail).
Bare meter/meters now flags only in measurement contexts; prefixed
kilometers/centimeters/millimeters gain coverage. 105 rules, 1,182
spellings; docs and skill digests updated.

Check page privacy note: 'your document never leaves your browser'.

Co-Authored-By: Claude Fable 5 <noreply@anthropic.com>
</commit_message>
<xml_diff>
--- a/tests/sample - annotated.docx
+++ b/tests/sample - annotated.docx
@@ -437,7 +437,7 @@
 
 <file path=word/comments.xml><?xml version="1.0" encoding="utf-8"?>
 <w:comments xmlns:w="http://schemas.openxmlformats.org/wordprocessingml/2006/main">
-  <w:comment w:id="0" w:author="Style Manual Check" w:initials="SMC" w:date="2026-07-17T06:52:21Z">
+  <w:comment w:id="0" w:author="Style Manual Check" w:initials="SMC" w:date="2026-07-17T07:32:14Z">
     <w:p>
       <w:pPr>
         <w:pStyle w:val="CommentText"/>
@@ -503,7 +503,7 @@
       </w:r>
     </w:p>
   </w:comment>
-  <w:comment w:id="1" w:author="Style Manual Check" w:initials="SMC" w:date="2026-07-17T06:52:21Z">
+  <w:comment w:id="1" w:author="Style Manual Check" w:initials="SMC" w:date="2026-07-17T07:32:14Z">
     <w:p>
       <w:pPr>
         <w:pStyle w:val="CommentText"/>
@@ -529,7 +529,7 @@
       </w:r>
     </w:p>
   </w:comment>
-  <w:comment w:id="2" w:author="Style Manual Check" w:initials="SMC" w:date="2026-07-17T06:52:21Z">
+  <w:comment w:id="2" w:author="Style Manual Check" w:initials="SMC" w:date="2026-07-17T07:32:14Z">
     <w:p>
       <w:pPr>
         <w:pStyle w:val="CommentText"/>
@@ -555,7 +555,7 @@
       </w:r>
     </w:p>
   </w:comment>
-  <w:comment w:id="3" w:author="Style Manual Check" w:initials="SMC" w:date="2026-07-17T06:52:21Z">
+  <w:comment w:id="3" w:author="Style Manual Check" w:initials="SMC" w:date="2026-07-17T07:32:14Z">
     <w:p>
       <w:pPr>
         <w:pStyle w:val="CommentText"/>
@@ -581,7 +581,7 @@
       </w:r>
     </w:p>
   </w:comment>
-  <w:comment w:id="4" w:author="Style Manual Check" w:initials="SMC" w:date="2026-07-17T06:52:21Z">
+  <w:comment w:id="4" w:author="Style Manual Check" w:initials="SMC" w:date="2026-07-17T07:32:14Z">
     <w:p>
       <w:pPr>
         <w:pStyle w:val="CommentText"/>
@@ -607,7 +607,7 @@
       </w:r>
     </w:p>
   </w:comment>
-  <w:comment w:id="5" w:author="Style Manual Check" w:initials="SMC" w:date="2026-07-17T06:52:21Z">
+  <w:comment w:id="5" w:author="Style Manual Check" w:initials="SMC" w:date="2026-07-17T07:32:14Z">
     <w:p>
       <w:pPr>
         <w:pStyle w:val="CommentText"/>
@@ -633,7 +633,7 @@
       </w:r>
     </w:p>
   </w:comment>
-  <w:comment w:id="6" w:author="Style Manual Check" w:initials="SMC" w:date="2026-07-17T06:52:21Z">
+  <w:comment w:id="6" w:author="Style Manual Check" w:initials="SMC" w:date="2026-07-17T07:32:14Z">
     <w:p>
       <w:pPr>
         <w:pStyle w:val="CommentText"/>
@@ -659,7 +659,7 @@
       </w:r>
     </w:p>
   </w:comment>
-  <w:comment w:id="7" w:author="Style Manual Check" w:initials="SMC" w:date="2026-07-17T06:52:21Z">
+  <w:comment w:id="7" w:author="Style Manual Check" w:initials="SMC" w:date="2026-07-17T07:32:14Z">
     <w:p>
       <w:pPr>
         <w:pStyle w:val="CommentText"/>
@@ -685,7 +685,7 @@
       </w:r>
     </w:p>
   </w:comment>
-  <w:comment w:id="8" w:author="Style Manual Check" w:initials="SMC" w:date="2026-07-17T06:52:21Z">
+  <w:comment w:id="8" w:author="Style Manual Check" w:initials="SMC" w:date="2026-07-17T07:32:14Z">
     <w:p>
       <w:pPr>
         <w:pStyle w:val="CommentText"/>
@@ -711,7 +711,7 @@
       </w:r>
     </w:p>
   </w:comment>
-  <w:comment w:id="9" w:author="Style Manual Check" w:initials="SMC" w:date="2026-07-17T06:52:21Z">
+  <w:comment w:id="9" w:author="Style Manual Check" w:initials="SMC" w:date="2026-07-17T07:32:14Z">
     <w:p>
       <w:pPr>
         <w:pStyle w:val="CommentText"/>
@@ -737,7 +737,7 @@
       </w:r>
     </w:p>
   </w:comment>
-  <w:comment w:id="10" w:author="Style Manual Check" w:initials="SMC" w:date="2026-07-17T06:52:21Z">
+  <w:comment w:id="10" w:author="Style Manual Check" w:initials="SMC" w:date="2026-07-17T07:32:14Z">
     <w:p>
       <w:pPr>
         <w:pStyle w:val="CommentText"/>
@@ -763,7 +763,7 @@
       </w:r>
     </w:p>
   </w:comment>
-  <w:comment w:id="11" w:author="Style Manual Check" w:initials="SMC" w:date="2026-07-17T06:52:21Z">
+  <w:comment w:id="11" w:author="Style Manual Check" w:initials="SMC" w:date="2026-07-17T07:32:14Z">
     <w:p>
       <w:pPr>
         <w:pStyle w:val="CommentText"/>
@@ -821,7 +821,7 @@
       </w:r>
     </w:p>
   </w:comment>
-  <w:comment w:id="12" w:author="Style Manual Check" w:initials="SMC" w:date="2026-07-17T06:52:21Z">
+  <w:comment w:id="12" w:author="Style Manual Check" w:initials="SMC" w:date="2026-07-17T07:32:14Z">
     <w:p>
       <w:pPr>
         <w:pStyle w:val="CommentText"/>
@@ -847,7 +847,7 @@
       </w:r>
     </w:p>
   </w:comment>
-  <w:comment w:id="13" w:author="Style Manual Check" w:initials="SMC" w:date="2026-07-17T06:52:21Z">
+  <w:comment w:id="13" w:author="Style Manual Check" w:initials="SMC" w:date="2026-07-17T07:32:14Z">
     <w:p>
       <w:pPr>
         <w:pStyle w:val="CommentText"/>
@@ -873,7 +873,7 @@
       </w:r>
     </w:p>
   </w:comment>
-  <w:comment w:id="14" w:author="Style Manual Check" w:initials="SMC" w:date="2026-07-17T06:52:21Z">
+  <w:comment w:id="14" w:author="Style Manual Check" w:initials="SMC" w:date="2026-07-17T07:32:14Z">
     <w:p>
       <w:pPr>
         <w:pStyle w:val="CommentText"/>
@@ -899,7 +899,7 @@
       </w:r>
     </w:p>
   </w:comment>
-  <w:comment w:id="15" w:author="Style Manual Check" w:initials="SMC" w:date="2026-07-17T06:52:21Z">
+  <w:comment w:id="15" w:author="Style Manual Check" w:initials="SMC" w:date="2026-07-17T07:32:14Z">
     <w:p>
       <w:pPr>
         <w:pStyle w:val="CommentText"/>
@@ -925,7 +925,7 @@
       </w:r>
     </w:p>
   </w:comment>
-  <w:comment w:id="16" w:author="Style Manual Check" w:initials="SMC" w:date="2026-07-17T06:52:21Z">
+  <w:comment w:id="16" w:author="Style Manual Check" w:initials="SMC" w:date="2026-07-17T07:32:14Z">
     <w:p>
       <w:pPr>
         <w:pStyle w:val="CommentText"/>
@@ -951,7 +951,7 @@
       </w:r>
     </w:p>
   </w:comment>
-  <w:comment w:id="17" w:author="Style Manual Check" w:initials="SMC" w:date="2026-07-17T06:52:21Z">
+  <w:comment w:id="17" w:author="Style Manual Check" w:initials="SMC" w:date="2026-07-17T07:32:14Z">
     <w:p>
       <w:pPr>
         <w:pStyle w:val="CommentText"/>
@@ -1017,7 +1017,7 @@
       </w:r>
     </w:p>
   </w:comment>
-  <w:comment w:id="18" w:author="Style Manual Check" w:initials="SMC" w:date="2026-07-17T06:52:21Z">
+  <w:comment w:id="18" w:author="Style Manual Check" w:initials="SMC" w:date="2026-07-17T07:32:14Z">
     <w:p>
       <w:pPr>
         <w:pStyle w:val="CommentText"/>
@@ -1051,7 +1051,7 @@
       </w:r>
     </w:p>
   </w:comment>
-  <w:comment w:id="19" w:author="Style Manual Check" w:initials="SMC" w:date="2026-07-17T06:52:21Z">
+  <w:comment w:id="19" w:author="Style Manual Check" w:initials="SMC" w:date="2026-07-17T07:32:14Z">
     <w:p>
       <w:pPr>
         <w:pStyle w:val="CommentText"/>
@@ -1077,7 +1077,7 @@
       </w:r>
     </w:p>
   </w:comment>
-  <w:comment w:id="20" w:author="Style Manual Check" w:initials="SMC" w:date="2026-07-17T06:52:21Z">
+  <w:comment w:id="20" w:author="Style Manual Check" w:initials="SMC" w:date="2026-07-17T07:32:14Z">
     <w:p>
       <w:pPr>
         <w:pStyle w:val="CommentText"/>
@@ -1103,7 +1103,7 @@
       </w:r>
     </w:p>
   </w:comment>
-  <w:comment w:id="21" w:author="Style Manual Check" w:initials="SMC" w:date="2026-07-17T06:52:21Z">
+  <w:comment w:id="21" w:author="Style Manual Check" w:initials="SMC" w:date="2026-07-17T07:32:14Z">
     <w:p>
       <w:pPr>
         <w:pStyle w:val="CommentText"/>
@@ -1129,7 +1129,7 @@
       </w:r>
     </w:p>
   </w:comment>
-  <w:comment w:id="22" w:author="Style Manual Check" w:initials="SMC" w:date="2026-07-17T06:52:21Z">
+  <w:comment w:id="22" w:author="Style Manual Check" w:initials="SMC" w:date="2026-07-17T07:32:14Z">
     <w:p>
       <w:pPr>
         <w:pStyle w:val="CommentText"/>
@@ -1155,7 +1155,7 @@
       </w:r>
     </w:p>
   </w:comment>
-  <w:comment w:id="23" w:author="Style Manual Check" w:initials="SMC" w:date="2026-07-17T06:52:21Z">
+  <w:comment w:id="23" w:author="Style Manual Check" w:initials="SMC" w:date="2026-07-17T07:32:14Z">
     <w:p>
       <w:pPr>
         <w:pStyle w:val="CommentText"/>
@@ -1181,7 +1181,7 @@
       </w:r>
     </w:p>
   </w:comment>
-  <w:comment w:id="24" w:author="Style Manual Check" w:initials="SMC" w:date="2026-07-17T06:52:21Z">
+  <w:comment w:id="24" w:author="Style Manual Check" w:initials="SMC" w:date="2026-07-17T07:32:14Z">
     <w:p>
       <w:pPr>
         <w:pStyle w:val="CommentText"/>
@@ -1207,7 +1207,7 @@
       </w:r>
     </w:p>
   </w:comment>
-  <w:comment w:id="25" w:author="Style Manual Check" w:initials="SMC" w:date="2026-07-17T06:52:21Z">
+  <w:comment w:id="25" w:author="Style Manual Check" w:initials="SMC" w:date="2026-07-17T07:32:14Z">
     <w:p>
       <w:pPr>
         <w:pStyle w:val="CommentText"/>

</xml_diff>

<commit_message>
Remove sulfur from the US spellings list
Macquarie notes the scientific spelling is now standard worldwide, and
government documents mentioning it are technical. 1,181 spellings.

Co-Authored-By: Claude Fable 5 <noreply@anthropic.com>
</commit_message>
<xml_diff>
--- a/tests/sample - annotated.docx
+++ b/tests/sample - annotated.docx
@@ -437,7 +437,7 @@
 
 <file path=word/comments.xml><?xml version="1.0" encoding="utf-8"?>
 <w:comments xmlns:w="http://schemas.openxmlformats.org/wordprocessingml/2006/main">
-  <w:comment w:id="0" w:author="Style Manual Check" w:initials="SMC" w:date="2026-07-17T07:32:14Z">
+  <w:comment w:id="0" w:author="Style Manual Check" w:initials="SMC" w:date="2026-07-17T07:44:22Z">
     <w:p>
       <w:pPr>
         <w:pStyle w:val="CommentText"/>
@@ -503,7 +503,7 @@
       </w:r>
     </w:p>
   </w:comment>
-  <w:comment w:id="1" w:author="Style Manual Check" w:initials="SMC" w:date="2026-07-17T07:32:14Z">
+  <w:comment w:id="1" w:author="Style Manual Check" w:initials="SMC" w:date="2026-07-17T07:44:22Z">
     <w:p>
       <w:pPr>
         <w:pStyle w:val="CommentText"/>
@@ -529,7 +529,7 @@
       </w:r>
     </w:p>
   </w:comment>
-  <w:comment w:id="2" w:author="Style Manual Check" w:initials="SMC" w:date="2026-07-17T07:32:14Z">
+  <w:comment w:id="2" w:author="Style Manual Check" w:initials="SMC" w:date="2026-07-17T07:44:22Z">
     <w:p>
       <w:pPr>
         <w:pStyle w:val="CommentText"/>
@@ -555,7 +555,7 @@
       </w:r>
     </w:p>
   </w:comment>
-  <w:comment w:id="3" w:author="Style Manual Check" w:initials="SMC" w:date="2026-07-17T07:32:14Z">
+  <w:comment w:id="3" w:author="Style Manual Check" w:initials="SMC" w:date="2026-07-17T07:44:22Z">
     <w:p>
       <w:pPr>
         <w:pStyle w:val="CommentText"/>
@@ -581,7 +581,7 @@
       </w:r>
     </w:p>
   </w:comment>
-  <w:comment w:id="4" w:author="Style Manual Check" w:initials="SMC" w:date="2026-07-17T07:32:14Z">
+  <w:comment w:id="4" w:author="Style Manual Check" w:initials="SMC" w:date="2026-07-17T07:44:22Z">
     <w:p>
       <w:pPr>
         <w:pStyle w:val="CommentText"/>
@@ -607,7 +607,7 @@
       </w:r>
     </w:p>
   </w:comment>
-  <w:comment w:id="5" w:author="Style Manual Check" w:initials="SMC" w:date="2026-07-17T07:32:14Z">
+  <w:comment w:id="5" w:author="Style Manual Check" w:initials="SMC" w:date="2026-07-17T07:44:22Z">
     <w:p>
       <w:pPr>
         <w:pStyle w:val="CommentText"/>
@@ -633,7 +633,7 @@
       </w:r>
     </w:p>
   </w:comment>
-  <w:comment w:id="6" w:author="Style Manual Check" w:initials="SMC" w:date="2026-07-17T07:32:14Z">
+  <w:comment w:id="6" w:author="Style Manual Check" w:initials="SMC" w:date="2026-07-17T07:44:22Z">
     <w:p>
       <w:pPr>
         <w:pStyle w:val="CommentText"/>
@@ -659,7 +659,7 @@
       </w:r>
     </w:p>
   </w:comment>
-  <w:comment w:id="7" w:author="Style Manual Check" w:initials="SMC" w:date="2026-07-17T07:32:14Z">
+  <w:comment w:id="7" w:author="Style Manual Check" w:initials="SMC" w:date="2026-07-17T07:44:22Z">
     <w:p>
       <w:pPr>
         <w:pStyle w:val="CommentText"/>
@@ -685,7 +685,7 @@
       </w:r>
     </w:p>
   </w:comment>
-  <w:comment w:id="8" w:author="Style Manual Check" w:initials="SMC" w:date="2026-07-17T07:32:14Z">
+  <w:comment w:id="8" w:author="Style Manual Check" w:initials="SMC" w:date="2026-07-17T07:44:22Z">
     <w:p>
       <w:pPr>
         <w:pStyle w:val="CommentText"/>
@@ -711,7 +711,7 @@
       </w:r>
     </w:p>
   </w:comment>
-  <w:comment w:id="9" w:author="Style Manual Check" w:initials="SMC" w:date="2026-07-17T07:32:14Z">
+  <w:comment w:id="9" w:author="Style Manual Check" w:initials="SMC" w:date="2026-07-17T07:44:22Z">
     <w:p>
       <w:pPr>
         <w:pStyle w:val="CommentText"/>
@@ -737,7 +737,7 @@
       </w:r>
     </w:p>
   </w:comment>
-  <w:comment w:id="10" w:author="Style Manual Check" w:initials="SMC" w:date="2026-07-17T07:32:14Z">
+  <w:comment w:id="10" w:author="Style Manual Check" w:initials="SMC" w:date="2026-07-17T07:44:22Z">
     <w:p>
       <w:pPr>
         <w:pStyle w:val="CommentText"/>
@@ -763,7 +763,7 @@
       </w:r>
     </w:p>
   </w:comment>
-  <w:comment w:id="11" w:author="Style Manual Check" w:initials="SMC" w:date="2026-07-17T07:32:14Z">
+  <w:comment w:id="11" w:author="Style Manual Check" w:initials="SMC" w:date="2026-07-17T07:44:22Z">
     <w:p>
       <w:pPr>
         <w:pStyle w:val="CommentText"/>
@@ -821,7 +821,7 @@
       </w:r>
     </w:p>
   </w:comment>
-  <w:comment w:id="12" w:author="Style Manual Check" w:initials="SMC" w:date="2026-07-17T07:32:14Z">
+  <w:comment w:id="12" w:author="Style Manual Check" w:initials="SMC" w:date="2026-07-17T07:44:22Z">
     <w:p>
       <w:pPr>
         <w:pStyle w:val="CommentText"/>
@@ -847,7 +847,7 @@
       </w:r>
     </w:p>
   </w:comment>
-  <w:comment w:id="13" w:author="Style Manual Check" w:initials="SMC" w:date="2026-07-17T07:32:14Z">
+  <w:comment w:id="13" w:author="Style Manual Check" w:initials="SMC" w:date="2026-07-17T07:44:22Z">
     <w:p>
       <w:pPr>
         <w:pStyle w:val="CommentText"/>
@@ -873,7 +873,7 @@
       </w:r>
     </w:p>
   </w:comment>
-  <w:comment w:id="14" w:author="Style Manual Check" w:initials="SMC" w:date="2026-07-17T07:32:14Z">
+  <w:comment w:id="14" w:author="Style Manual Check" w:initials="SMC" w:date="2026-07-17T07:44:22Z">
     <w:p>
       <w:pPr>
         <w:pStyle w:val="CommentText"/>
@@ -899,7 +899,7 @@
       </w:r>
     </w:p>
   </w:comment>
-  <w:comment w:id="15" w:author="Style Manual Check" w:initials="SMC" w:date="2026-07-17T07:32:14Z">
+  <w:comment w:id="15" w:author="Style Manual Check" w:initials="SMC" w:date="2026-07-17T07:44:22Z">
     <w:p>
       <w:pPr>
         <w:pStyle w:val="CommentText"/>
@@ -925,7 +925,7 @@
       </w:r>
     </w:p>
   </w:comment>
-  <w:comment w:id="16" w:author="Style Manual Check" w:initials="SMC" w:date="2026-07-17T07:32:14Z">
+  <w:comment w:id="16" w:author="Style Manual Check" w:initials="SMC" w:date="2026-07-17T07:44:22Z">
     <w:p>
       <w:pPr>
         <w:pStyle w:val="CommentText"/>
@@ -951,7 +951,7 @@
       </w:r>
     </w:p>
   </w:comment>
-  <w:comment w:id="17" w:author="Style Manual Check" w:initials="SMC" w:date="2026-07-17T07:32:14Z">
+  <w:comment w:id="17" w:author="Style Manual Check" w:initials="SMC" w:date="2026-07-17T07:44:22Z">
     <w:p>
       <w:pPr>
         <w:pStyle w:val="CommentText"/>
@@ -1017,7 +1017,7 @@
       </w:r>
     </w:p>
   </w:comment>
-  <w:comment w:id="18" w:author="Style Manual Check" w:initials="SMC" w:date="2026-07-17T07:32:14Z">
+  <w:comment w:id="18" w:author="Style Manual Check" w:initials="SMC" w:date="2026-07-17T07:44:22Z">
     <w:p>
       <w:pPr>
         <w:pStyle w:val="CommentText"/>
@@ -1051,7 +1051,7 @@
       </w:r>
     </w:p>
   </w:comment>
-  <w:comment w:id="19" w:author="Style Manual Check" w:initials="SMC" w:date="2026-07-17T07:32:14Z">
+  <w:comment w:id="19" w:author="Style Manual Check" w:initials="SMC" w:date="2026-07-17T07:44:22Z">
     <w:p>
       <w:pPr>
         <w:pStyle w:val="CommentText"/>
@@ -1077,7 +1077,7 @@
       </w:r>
     </w:p>
   </w:comment>
-  <w:comment w:id="20" w:author="Style Manual Check" w:initials="SMC" w:date="2026-07-17T07:32:14Z">
+  <w:comment w:id="20" w:author="Style Manual Check" w:initials="SMC" w:date="2026-07-17T07:44:22Z">
     <w:p>
       <w:pPr>
         <w:pStyle w:val="CommentText"/>
@@ -1103,7 +1103,7 @@
       </w:r>
     </w:p>
   </w:comment>
-  <w:comment w:id="21" w:author="Style Manual Check" w:initials="SMC" w:date="2026-07-17T07:32:14Z">
+  <w:comment w:id="21" w:author="Style Manual Check" w:initials="SMC" w:date="2026-07-17T07:44:22Z">
     <w:p>
       <w:pPr>
         <w:pStyle w:val="CommentText"/>
@@ -1129,7 +1129,7 @@
       </w:r>
     </w:p>
   </w:comment>
-  <w:comment w:id="22" w:author="Style Manual Check" w:initials="SMC" w:date="2026-07-17T07:32:14Z">
+  <w:comment w:id="22" w:author="Style Manual Check" w:initials="SMC" w:date="2026-07-17T07:44:22Z">
     <w:p>
       <w:pPr>
         <w:pStyle w:val="CommentText"/>
@@ -1155,7 +1155,7 @@
       </w:r>
     </w:p>
   </w:comment>
-  <w:comment w:id="23" w:author="Style Manual Check" w:initials="SMC" w:date="2026-07-17T07:32:14Z">
+  <w:comment w:id="23" w:author="Style Manual Check" w:initials="SMC" w:date="2026-07-17T07:44:22Z">
     <w:p>
       <w:pPr>
         <w:pStyle w:val="CommentText"/>
@@ -1181,7 +1181,7 @@
       </w:r>
     </w:p>
   </w:comment>
-  <w:comment w:id="24" w:author="Style Manual Check" w:initials="SMC" w:date="2026-07-17T07:32:14Z">
+  <w:comment w:id="24" w:author="Style Manual Check" w:initials="SMC" w:date="2026-07-17T07:44:22Z">
     <w:p>
       <w:pPr>
         <w:pStyle w:val="CommentText"/>
@@ -1207,7 +1207,7 @@
       </w:r>
     </w:p>
   </w:comment>
-  <w:comment w:id="25" w:author="Style Manual Check" w:initials="SMC" w:date="2026-07-17T07:32:14Z">
+  <w:comment w:id="25" w:author="Style Manual Check" w:initials="SMC" w:date="2026-07-17T07:44:22Z">
     <w:p>
       <w:pPr>
         <w:pStyle w:val="CommentText"/>

</xml_diff>

<commit_message>
Lists feedback round 1: one list comment per list; delete plural-apostrophe rule
Delete abbrev-plural-apostrophe (mangled possessives like the AIHW's in AI output). Remove 'contact' from both verb lists. Mixed-form lists decide type by item majority. Check a document emits a single generic list-check comment pointing at Format a list. Recognise en dash bullets; keep w:ilvl in loadDocx. Sample counts 37/30/7 -> 36/30/6; paste example 12 -> 10.
</commit_message>
<xml_diff>
--- a/tests/sample - annotated.docx
+++ b/tests/sample - annotated.docx
@@ -246,7 +246,7 @@
       </w:pPr>
       <w:commentRangeStart w:id="16"/>
       <w:r>
-        <w:t xml:space="preserve">F</w:t>
+        <w:t xml:space="preserve">First</w:t>
       </w:r>
       <w:commentRangeEnd w:id="16"/>
       <w:r>
@@ -256,7 +256,7 @@
         <w:commentReference w:id="16"/>
       </w:r>
       <w:r>
-        <w:t xml:space="preserve">irst item ends with a semicolon;</w:t>
+        <w:t xml:space="preserve"> item ends with a semicolon;</w:t>
       </w:r>
     </w:p>
     <w:p>
@@ -265,7 +265,7 @@
       </w:pPr>
       <w:commentRangeStart w:id="17"/>
       <w:r>
-        <w:t xml:space="preserve">Second</w:t>
+        <w:t xml:space="preserve">Sec</w:t>
       </w:r>
       <w:commentRangeEnd w:id="17"/>
       <w:r>
@@ -275,16 +275,32 @@
         <w:commentReference w:id="17"/>
       </w:r>
       <w:r>
-        <w:t xml:space="preserve"> item ends with and; and</w:t>
+        <w:t xml:space="preserve">ond item ends with and; and</w:t>
       </w:r>
     </w:p>
     <w:p>
       <w:pPr>
         <w:pStyle w:val="ListBullet"/>
       </w:pPr>
+      <w:r>
+        <w:t>Third item ends with a full stop.</w:t>
+      </w:r>
+    </w:p>
+    <w:p>
       <w:commentRangeStart w:id="18"/>
+      <w:commentRangeStart w:id="19"/>
       <w:r>
-        <w:t xml:space="preserve">Third</w:t>
+        <w:rPr>
+          <w:b/>
+        </w:rPr>
+        <w:t>This Bold Line Is Really A Heading</w:t>
+      </w:r>
+      <w:commentRangeEnd w:id="19"/>
+      <w:r>
+        <w:rPr>
+          <w:rStyle w:val="CommentReference"/>
+        </w:rPr>
+        <w:commentReference w:id="19"/>
       </w:r>
       <w:commentRangeEnd w:id="18"/>
       <w:r>
@@ -293,39 +309,12 @@
         </w:rPr>
         <w:commentReference w:id="18"/>
       </w:r>
-      <w:r>
-        <w:t xml:space="preserve"> item ends with a full stop.</w:t>
-      </w:r>
-    </w:p>
-    <w:p>
-      <w:commentRangeStart w:id="19"/>
-      <w:commentRangeStart w:id="20"/>
-      <w:r>
-        <w:rPr>
-          <w:b/>
-        </w:rPr>
-        <w:t>This Bold Line Is Really A Heading</w:t>
-      </w:r>
-      <w:commentRangeEnd w:id="20"/>
-      <w:r>
-        <w:rPr>
-          <w:rStyle w:val="CommentReference"/>
-        </w:rPr>
-        <w:commentReference w:id="20"/>
-      </w:r>
-      <w:commentRangeEnd w:id="19"/>
-      <w:r>
-        <w:rPr>
-          <w:rStyle w:val="CommentReference"/>
-        </w:rPr>
-        <w:commentReference w:id="19"/>
-      </w:r>
     </w:p>
     <w:p>
       <w:r>
         <w:t xml:space="preserve">The </w:t>
       </w:r>
-      <w:commentRangeStart w:id="23"/>
+      <w:commentRangeStart w:id="22"/>
       <w:r>
         <w:t xml:space="preserve">org</w:t>
       </w:r>
@@ -338,21 +327,6 @@
       <w:r>
         <w:t xml:space="preserve">d</w:t>
       </w:r>
-      <w:commentRangeEnd w:id="23"/>
-      <w:r>
-        <w:rPr>
-          <w:rStyle w:val="CommentReference"/>
-        </w:rPr>
-        <w:commentReference w:id="23"/>
-      </w:r>
-      <w:r>
-        <w:t xml:space="preserve"> committee met at </w:t>
-      </w:r>
-      <w:commentRangeStart w:id="21"/>
-      <w:commentRangeStart w:id="22"/>
-      <w:r>
-        <w:t xml:space="preserve">3.30pm</w:t>
-      </w:r>
       <w:commentRangeEnd w:id="22"/>
       <w:r>
         <w:rPr>
@@ -360,12 +334,27 @@
         </w:rPr>
         <w:commentReference w:id="22"/>
       </w:r>
+      <w:r>
+        <w:t xml:space="preserve"> committee met at </w:t>
+      </w:r>
+      <w:commentRangeStart w:id="20"/>
+      <w:commentRangeStart w:id="21"/>
+      <w:r>
+        <w:t xml:space="preserve">3.30pm</w:t>
+      </w:r>
       <w:commentRangeEnd w:id="21"/>
       <w:r>
         <w:rPr>
           <w:rStyle w:val="CommentReference"/>
         </w:rPr>
         <w:commentReference w:id="21"/>
+      </w:r>
+      <w:commentRangeEnd w:id="20"/>
+      <w:r>
+        <w:rPr>
+          <w:rStyle w:val="CommentReference"/>
+        </w:rPr>
+        <w:commentReference w:id="20"/>
       </w:r>
       <w:r>
         <w:t xml:space="preserve">.</w:t>
@@ -386,16 +375,16 @@
             <w:tcW w:type="dxa" w:w="4320"/>
           </w:tcPr>
           <w:p>
-            <w:commentRangeStart w:id="24"/>
+            <w:commentRangeStart w:id="23"/>
             <w:r>
               <w:t xml:space="preserve">Colorful</w:t>
             </w:r>
-            <w:commentRangeEnd w:id="24"/>
+            <w:commentRangeEnd w:id="23"/>
             <w:r>
               <w:rPr>
                 <w:rStyle w:val="CommentReference"/>
               </w:rPr>
-              <w:commentReference w:id="24"/>
+              <w:commentReference w:id="23"/>
             </w:r>
             <w:r>
               <w:t xml:space="preserve"> data</w:t>
@@ -407,16 +396,16 @@
             <w:tcW w:type="dxa" w:w="4320"/>
           </w:tcPr>
           <w:p>
-            <w:commentRangeStart w:id="25"/>
+            <w:commentRangeStart w:id="24"/>
             <w:r>
               <w:t xml:space="preserve">Approx.</w:t>
             </w:r>
-            <w:commentRangeEnd w:id="25"/>
+            <w:commentRangeEnd w:id="24"/>
             <w:r>
               <w:rPr>
                 <w:rStyle w:val="CommentReference"/>
               </w:rPr>
-              <w:commentReference w:id="25"/>
+              <w:commentReference w:id="24"/>
             </w:r>
             <w:r>
               <w:t xml:space="preserve"> 100 items</w:t>
@@ -437,7 +426,7 @@
 
 <file path=word/comments.xml><?xml version="1.0" encoding="utf-8"?>
 <w:comments xmlns:w="http://schemas.openxmlformats.org/wordprocessingml/2006/main">
-  <w:comment w:id="0" w:author="Style Manual Check" w:initials="SMC" w:date="2026-07-17T07:44:22Z">
+  <w:comment w:id="0" w:author="Style Manual Check" w:initials="SMC" w:date="2026-07-28T13:25:07Z">
     <w:p>
       <w:pPr>
         <w:pStyle w:val="CommentText"/>
@@ -503,7 +492,7 @@
       </w:r>
     </w:p>
   </w:comment>
-  <w:comment w:id="1" w:author="Style Manual Check" w:initials="SMC" w:date="2026-07-17T07:44:22Z">
+  <w:comment w:id="1" w:author="Style Manual Check" w:initials="SMC" w:date="2026-07-28T13:25:07Z">
     <w:p>
       <w:pPr>
         <w:pStyle w:val="CommentText"/>
@@ -529,7 +518,7 @@
       </w:r>
     </w:p>
   </w:comment>
-  <w:comment w:id="2" w:author="Style Manual Check" w:initials="SMC" w:date="2026-07-17T07:44:22Z">
+  <w:comment w:id="2" w:author="Style Manual Check" w:initials="SMC" w:date="2026-07-28T13:25:07Z">
     <w:p>
       <w:pPr>
         <w:pStyle w:val="CommentText"/>
@@ -555,7 +544,7 @@
       </w:r>
     </w:p>
   </w:comment>
-  <w:comment w:id="3" w:author="Style Manual Check" w:initials="SMC" w:date="2026-07-17T07:44:22Z">
+  <w:comment w:id="3" w:author="Style Manual Check" w:initials="SMC" w:date="2026-07-28T13:25:07Z">
     <w:p>
       <w:pPr>
         <w:pStyle w:val="CommentText"/>
@@ -581,7 +570,7 @@
       </w:r>
     </w:p>
   </w:comment>
-  <w:comment w:id="4" w:author="Style Manual Check" w:initials="SMC" w:date="2026-07-17T07:44:22Z">
+  <w:comment w:id="4" w:author="Style Manual Check" w:initials="SMC" w:date="2026-07-28T13:25:07Z">
     <w:p>
       <w:pPr>
         <w:pStyle w:val="CommentText"/>
@@ -607,7 +596,7 @@
       </w:r>
     </w:p>
   </w:comment>
-  <w:comment w:id="5" w:author="Style Manual Check" w:initials="SMC" w:date="2026-07-17T07:44:22Z">
+  <w:comment w:id="5" w:author="Style Manual Check" w:initials="SMC" w:date="2026-07-28T13:25:07Z">
     <w:p>
       <w:pPr>
         <w:pStyle w:val="CommentText"/>
@@ -633,7 +622,7 @@
       </w:r>
     </w:p>
   </w:comment>
-  <w:comment w:id="6" w:author="Style Manual Check" w:initials="SMC" w:date="2026-07-17T07:44:22Z">
+  <w:comment w:id="6" w:author="Style Manual Check" w:initials="SMC" w:date="2026-07-28T13:25:07Z">
     <w:p>
       <w:pPr>
         <w:pStyle w:val="CommentText"/>
@@ -659,7 +648,7 @@
       </w:r>
     </w:p>
   </w:comment>
-  <w:comment w:id="7" w:author="Style Manual Check" w:initials="SMC" w:date="2026-07-17T07:44:22Z">
+  <w:comment w:id="7" w:author="Style Manual Check" w:initials="SMC" w:date="2026-07-28T13:25:07Z">
     <w:p>
       <w:pPr>
         <w:pStyle w:val="CommentText"/>
@@ -685,7 +674,7 @@
       </w:r>
     </w:p>
   </w:comment>
-  <w:comment w:id="8" w:author="Style Manual Check" w:initials="SMC" w:date="2026-07-17T07:44:22Z">
+  <w:comment w:id="8" w:author="Style Manual Check" w:initials="SMC" w:date="2026-07-28T13:25:07Z">
     <w:p>
       <w:pPr>
         <w:pStyle w:val="CommentText"/>
@@ -711,7 +700,7 @@
       </w:r>
     </w:p>
   </w:comment>
-  <w:comment w:id="9" w:author="Style Manual Check" w:initials="SMC" w:date="2026-07-17T07:44:22Z">
+  <w:comment w:id="9" w:author="Style Manual Check" w:initials="SMC" w:date="2026-07-28T13:25:07Z">
     <w:p>
       <w:pPr>
         <w:pStyle w:val="CommentText"/>
@@ -737,7 +726,7 @@
       </w:r>
     </w:p>
   </w:comment>
-  <w:comment w:id="10" w:author="Style Manual Check" w:initials="SMC" w:date="2026-07-17T07:44:22Z">
+  <w:comment w:id="10" w:author="Style Manual Check" w:initials="SMC" w:date="2026-07-28T13:25:07Z">
     <w:p>
       <w:pPr>
         <w:pStyle w:val="CommentText"/>
@@ -763,7 +752,7 @@
       </w:r>
     </w:p>
   </w:comment>
-  <w:comment w:id="11" w:author="Style Manual Check" w:initials="SMC" w:date="2026-07-17T07:44:22Z">
+  <w:comment w:id="11" w:author="Style Manual Check" w:initials="SMC" w:date="2026-07-28T13:25:07Z">
     <w:p>
       <w:pPr>
         <w:pStyle w:val="CommentText"/>
@@ -821,7 +810,7 @@
       </w:r>
     </w:p>
   </w:comment>
-  <w:comment w:id="12" w:author="Style Manual Check" w:initials="SMC" w:date="2026-07-17T07:44:22Z">
+  <w:comment w:id="12" w:author="Style Manual Check" w:initials="SMC" w:date="2026-07-28T13:25:07Z">
     <w:p>
       <w:pPr>
         <w:pStyle w:val="CommentText"/>
@@ -847,7 +836,7 @@
       </w:r>
     </w:p>
   </w:comment>
-  <w:comment w:id="13" w:author="Style Manual Check" w:initials="SMC" w:date="2026-07-17T07:44:22Z">
+  <w:comment w:id="13" w:author="Style Manual Check" w:initials="SMC" w:date="2026-07-28T13:25:07Z">
     <w:p>
       <w:pPr>
         <w:pStyle w:val="CommentText"/>
@@ -873,7 +862,7 @@
       </w:r>
     </w:p>
   </w:comment>
-  <w:comment w:id="14" w:author="Style Manual Check" w:initials="SMC" w:date="2026-07-17T07:44:22Z">
+  <w:comment w:id="14" w:author="Style Manual Check" w:initials="SMC" w:date="2026-07-28T13:25:07Z">
     <w:p>
       <w:pPr>
         <w:pStyle w:val="CommentText"/>
@@ -899,7 +888,7 @@
       </w:r>
     </w:p>
   </w:comment>
-  <w:comment w:id="15" w:author="Style Manual Check" w:initials="SMC" w:date="2026-07-17T07:44:22Z">
+  <w:comment w:id="15" w:author="Style Manual Check" w:initials="SMC" w:date="2026-07-28T13:25:07Z">
     <w:p>
       <w:pPr>
         <w:pStyle w:val="CommentText"/>
@@ -925,7 +914,31 @@
       </w:r>
     </w:p>
   </w:comment>
-  <w:comment w:id="16" w:author="Style Manual Check" w:initials="SMC" w:date="2026-07-17T07:44:22Z">
+  <w:comment w:id="16" w:author="Style Manual Check" w:initials="SMC" w:date="2026-07-28T13:25:07Z">
+    <w:p>
+      <w:pPr>
+        <w:pStyle w:val="CommentText"/>
+      </w:pPr>
+      <w:r>
+        <w:t xml:space="preserve">Check this list: List formatting can be complex.</w:t>
+      </w:r>
+    </w:p>
+    <w:p>
+      <w:pPr>
+        <w:pStyle w:val="CommentText"/>
+      </w:pPr>
+      <w:r>
+        <w:t xml:space="preserve">Style Manual guidance: https://www.stylemanual.gov.au/structuring-content/lists</w:t>
+      </w:r>
+    </w:p>
+    <w:p>
+      <w:pPr>
+        <w:pStyle w:val="CommentText"/>
+      </w:pPr>
+      <w:r>
+        <w:t xml:space="preserve">Also flagged in this text:</w:t>
+      </w:r>
+    </w:p>
     <w:p>
       <w:pPr>
         <w:pStyle w:val="CommentText"/>
@@ -951,47 +964,7 @@
       </w:r>
     </w:p>
   </w:comment>
-  <w:comment w:id="17" w:author="Style Manual Check" w:initials="SMC" w:date="2026-07-17T07:44:22Z">
-    <w:p>
-      <w:pPr>
-        <w:pStyle w:val="CommentText"/>
-      </w:pPr>
-      <w:r>
-        <w:t xml:space="preserve">List item capitalisation: Sentence and stand-alone list items start with a capital letter. Fragment list items start lower case unless they begin with a proper noun.</w:t>
-      </w:r>
-    </w:p>
-    <w:p>
-      <w:pPr>
-        <w:pStyle w:val="CommentText"/>
-      </w:pPr>
-      <w:r>
-        <w:t xml:space="preserve">Suggested change: 'second'</w:t>
-      </w:r>
-    </w:p>
-    <w:p>
-      <w:pPr>
-        <w:pStyle w:val="CommentText"/>
-      </w:pPr>
-      <w:r>
-        <w:t xml:space="preserve">This looks like a fragment list (each item completes the lead-in), so items start lower case. Keep the capital if this is a proper noun.</w:t>
-      </w:r>
-    </w:p>
-    <w:p>
-      <w:pPr>
-        <w:pStyle w:val="CommentText"/>
-      </w:pPr>
-      <w:r>
-        <w:t xml:space="preserve">Style Manual guidance: https://www.stylemanual.gov.au/structuring-content/lists</w:t>
-      </w:r>
-    </w:p>
-    <w:p>
-      <w:pPr>
-        <w:pStyle w:val="CommentText"/>
-      </w:pPr>
-      <w:r>
-        <w:t xml:space="preserve">Also flagged in this text:</w:t>
-      </w:r>
-    </w:p>
+  <w:comment w:id="17" w:author="Style Manual Check" w:initials="SMC" w:date="2026-07-28T13:25:07Z">
     <w:p>
       <w:pPr>
         <w:pStyle w:val="CommentText"/>
@@ -1017,41 +990,7 @@
       </w:r>
     </w:p>
   </w:comment>
-  <w:comment w:id="18" w:author="Style Manual Check" w:initials="SMC" w:date="2026-07-17T07:44:22Z">
-    <w:p>
-      <w:pPr>
-        <w:pStyle w:val="CommentText"/>
-      </w:pPr>
-      <w:r>
-        <w:t xml:space="preserve">List item capitalisation: Sentence and stand-alone list items start with a capital letter. Fragment list items start lower case unless they begin with a proper noun.</w:t>
-      </w:r>
-    </w:p>
-    <w:p>
-      <w:pPr>
-        <w:pStyle w:val="CommentText"/>
-      </w:pPr>
-      <w:r>
-        <w:t xml:space="preserve">Suggested change: 'third'</w:t>
-      </w:r>
-    </w:p>
-    <w:p>
-      <w:pPr>
-        <w:pStyle w:val="CommentText"/>
-      </w:pPr>
-      <w:r>
-        <w:t xml:space="preserve">This looks like a fragment list (each item completes the lead-in), so items start lower case. Keep the capital if this is a proper noun.</w:t>
-      </w:r>
-    </w:p>
-    <w:p>
-      <w:pPr>
-        <w:pStyle w:val="CommentText"/>
-      </w:pPr>
-      <w:r>
-        <w:t xml:space="preserve">Style Manual guidance: https://www.stylemanual.gov.au/structuring-content/lists</w:t>
-      </w:r>
-    </w:p>
-  </w:comment>
-  <w:comment w:id="19" w:author="Style Manual Check" w:initials="SMC" w:date="2026-07-17T07:44:22Z">
+  <w:comment w:id="18" w:author="Style Manual Check" w:initials="SMC" w:date="2026-07-28T13:25:07Z">
     <w:p>
       <w:pPr>
         <w:pStyle w:val="CommentText"/>
@@ -1077,7 +1016,7 @@
       </w:r>
     </w:p>
   </w:comment>
-  <w:comment w:id="20" w:author="Style Manual Check" w:initials="SMC" w:date="2026-07-17T07:44:22Z">
+  <w:comment w:id="19" w:author="Style Manual Check" w:initials="SMC" w:date="2026-07-28T13:25:07Z">
     <w:p>
       <w:pPr>
         <w:pStyle w:val="CommentText"/>
@@ -1103,7 +1042,7 @@
       </w:r>
     </w:p>
   </w:comment>
-  <w:comment w:id="21" w:author="Style Manual Check" w:initials="SMC" w:date="2026-07-17T07:44:22Z">
+  <w:comment w:id="20" w:author="Style Manual Check" w:initials="SMC" w:date="2026-07-28T13:25:07Z">
     <w:p>
       <w:pPr>
         <w:pStyle w:val="CommentText"/>
@@ -1129,7 +1068,7 @@
       </w:r>
     </w:p>
   </w:comment>
-  <w:comment w:id="22" w:author="Style Manual Check" w:initials="SMC" w:date="2026-07-17T07:44:22Z">
+  <w:comment w:id="21" w:author="Style Manual Check" w:initials="SMC" w:date="2026-07-28T13:25:07Z">
     <w:p>
       <w:pPr>
         <w:pStyle w:val="CommentText"/>
@@ -1155,7 +1094,7 @@
       </w:r>
     </w:p>
   </w:comment>
-  <w:comment w:id="23" w:author="Style Manual Check" w:initials="SMC" w:date="2026-07-17T07:44:22Z">
+  <w:comment w:id="22" w:author="Style Manual Check" w:initials="SMC" w:date="2026-07-28T13:25:07Z">
     <w:p>
       <w:pPr>
         <w:pStyle w:val="CommentText"/>
@@ -1181,7 +1120,7 @@
       </w:r>
     </w:p>
   </w:comment>
-  <w:comment w:id="24" w:author="Style Manual Check" w:initials="SMC" w:date="2026-07-17T07:44:22Z">
+  <w:comment w:id="23" w:author="Style Manual Check" w:initials="SMC" w:date="2026-07-28T13:25:07Z">
     <w:p>
       <w:pPr>
         <w:pStyle w:val="CommentText"/>
@@ -1207,7 +1146,7 @@
       </w:r>
     </w:p>
   </w:comment>
-  <w:comment w:id="25" w:author="Style Manual Check" w:initials="SMC" w:date="2026-07-17T07:44:22Z">
+  <w:comment w:id="24" w:author="Style Manual Check" w:initials="SMC" w:date="2026-07-28T13:25:07Z">
     <w:p>
       <w:pPr>
         <w:pStyle w:val="CommentText"/>

</xml_diff>

<commit_message>
Impose model-declared list types on Ask and Make-it-plain output
The prompts now require a [[list:type]] marker before each list; a new
worker-side pass (im2026/src/list-convention.js) strips the marker and
imposes that type's punctuation, the same drafts-then-impose split that
makes Format a list reliable. Unmarked lists are left untouched, capitals
are only ever imposed upwards, and the marker never reaches a browser.

Co-Authored-By: Claude Fable 5 <noreply@anthropic.com>
</commit_message>
<xml_diff>
--- a/tests/sample - annotated.docx
+++ b/tests/sample - annotated.docx
@@ -440,7 +440,7 @@
 
 <file path=word/comments.xml><?xml version="1.0" encoding="utf-8"?>
 <w:comments xmlns:w="http://schemas.openxmlformats.org/wordprocessingml/2006/main" xmlns:r="http://schemas.openxmlformats.org/officeDocument/2006/relationships">
-  <w:comment w:id="0" w:author="Style Manual Check" w:initials="SMC" w:date="2026-08-17T11:17:14Z">
+  <w:comment w:id="0" w:author="Style Manual Check" w:initials="SMC" w:date="2026-08-18T07:22:12Z">
     <w:p>
       <w:pPr>
         <w:pStyle w:val="CommentText"/>
@@ -600,7 +600,7 @@
       </w:hyperlink>
     </w:p>
   </w:comment>
-  <w:comment w:id="1" w:author="Style Manual Check" w:initials="SMC" w:date="2026-08-17T11:17:14Z">
+  <w:comment w:id="1" w:author="Style Manual Check" w:initials="SMC" w:date="2026-08-18T07:22:12Z">
     <w:p>
       <w:pPr>
         <w:pStyle w:val="CommentText"/>
@@ -644,7 +644,7 @@
       </w:hyperlink>
     </w:p>
   </w:comment>
-  <w:comment w:id="2" w:author="Style Manual Check" w:initials="SMC" w:date="2026-08-17T11:17:14Z">
+  <w:comment w:id="2" w:author="Style Manual Check" w:initials="SMC" w:date="2026-08-18T07:22:12Z">
     <w:p>
       <w:pPr>
         <w:pStyle w:val="CommentText"/>
@@ -688,7 +688,7 @@
       </w:hyperlink>
     </w:p>
   </w:comment>
-  <w:comment w:id="3" w:author="Style Manual Check" w:initials="SMC" w:date="2026-08-17T11:17:14Z">
+  <w:comment w:id="3" w:author="Style Manual Check" w:initials="SMC" w:date="2026-08-18T07:22:12Z">
     <w:p>
       <w:pPr>
         <w:pStyle w:val="CommentText"/>
@@ -732,7 +732,7 @@
       </w:hyperlink>
     </w:p>
   </w:comment>
-  <w:comment w:id="4" w:author="Style Manual Check" w:initials="SMC" w:date="2026-08-17T11:17:14Z">
+  <w:comment w:id="4" w:author="Style Manual Check" w:initials="SMC" w:date="2026-08-18T07:22:12Z">
     <w:p>
       <w:pPr>
         <w:pStyle w:val="CommentText"/>
@@ -776,7 +776,7 @@
       </w:hyperlink>
     </w:p>
   </w:comment>
-  <w:comment w:id="5" w:author="Style Manual Check" w:initials="SMC" w:date="2026-08-17T11:17:14Z">
+  <w:comment w:id="5" w:author="Style Manual Check" w:initials="SMC" w:date="2026-08-18T07:22:12Z">
     <w:p>
       <w:pPr>
         <w:pStyle w:val="CommentText"/>
@@ -820,7 +820,7 @@
       </w:hyperlink>
     </w:p>
   </w:comment>
-  <w:comment w:id="6" w:author="Style Manual Check" w:initials="SMC" w:date="2026-08-17T11:17:14Z">
+  <w:comment w:id="6" w:author="Style Manual Check" w:initials="SMC" w:date="2026-08-18T07:22:12Z">
     <w:p>
       <w:pPr>
         <w:pStyle w:val="CommentText"/>
@@ -864,7 +864,7 @@
       </w:hyperlink>
     </w:p>
   </w:comment>
-  <w:comment w:id="7" w:author="Style Manual Check" w:initials="SMC" w:date="2026-08-17T11:17:14Z">
+  <w:comment w:id="7" w:author="Style Manual Check" w:initials="SMC" w:date="2026-08-18T07:22:12Z">
     <w:p>
       <w:pPr>
         <w:pStyle w:val="CommentText"/>
@@ -908,7 +908,7 @@
       </w:hyperlink>
     </w:p>
   </w:comment>
-  <w:comment w:id="8" w:author="Style Manual Check" w:initials="SMC" w:date="2026-08-17T11:17:14Z">
+  <w:comment w:id="8" w:author="Style Manual Check" w:initials="SMC" w:date="2026-08-18T07:22:12Z">
     <w:p>
       <w:pPr>
         <w:pStyle w:val="CommentText"/>
@@ -952,7 +952,7 @@
       </w:hyperlink>
     </w:p>
   </w:comment>
-  <w:comment w:id="9" w:author="Style Manual Check" w:initials="SMC" w:date="2026-08-17T11:17:14Z">
+  <w:comment w:id="9" w:author="Style Manual Check" w:initials="SMC" w:date="2026-08-18T07:22:12Z">
     <w:p>
       <w:pPr>
         <w:pStyle w:val="CommentText"/>
@@ -996,7 +996,7 @@
       </w:hyperlink>
     </w:p>
   </w:comment>
-  <w:comment w:id="10" w:author="Style Manual Check" w:initials="SMC" w:date="2026-08-17T11:17:14Z">
+  <w:comment w:id="10" w:author="Style Manual Check" w:initials="SMC" w:date="2026-08-18T07:22:12Z">
     <w:p>
       <w:pPr>
         <w:pStyle w:val="CommentText"/>
@@ -1040,7 +1040,7 @@
       </w:hyperlink>
     </w:p>
   </w:comment>
-  <w:comment w:id="11" w:author="Style Manual Check" w:initials="SMC" w:date="2026-08-17T11:17:14Z">
+  <w:comment w:id="11" w:author="Style Manual Check" w:initials="SMC" w:date="2026-08-18T07:22:12Z">
     <w:p>
       <w:pPr>
         <w:pStyle w:val="CommentText"/>
@@ -1084,7 +1084,7 @@
       </w:hyperlink>
     </w:p>
   </w:comment>
-  <w:comment w:id="12" w:author="Style Manual Check" w:initials="SMC" w:date="2026-08-17T11:17:14Z">
+  <w:comment w:id="12" w:author="Style Manual Check" w:initials="SMC" w:date="2026-08-18T07:22:12Z">
     <w:p>
       <w:pPr>
         <w:pStyle w:val="CommentText"/>
@@ -1178,7 +1178,7 @@
       </w:hyperlink>
     </w:p>
   </w:comment>
-  <w:comment w:id="13" w:author="Style Manual Check" w:initials="SMC" w:date="2026-08-17T11:17:14Z">
+  <w:comment w:id="13" w:author="Style Manual Check" w:initials="SMC" w:date="2026-08-18T07:22:12Z">
     <w:p>
       <w:pPr>
         <w:pStyle w:val="CommentText"/>
@@ -1222,7 +1222,7 @@
       </w:hyperlink>
     </w:p>
   </w:comment>
-  <w:comment w:id="14" w:author="Style Manual Check" w:initials="SMC" w:date="2026-08-17T11:17:14Z">
+  <w:comment w:id="14" w:author="Style Manual Check" w:initials="SMC" w:date="2026-08-18T07:22:12Z">
     <w:p>
       <w:pPr>
         <w:pStyle w:val="CommentText"/>
@@ -1266,7 +1266,7 @@
       </w:hyperlink>
     </w:p>
   </w:comment>
-  <w:comment w:id="15" w:author="Style Manual Check" w:initials="SMC" w:date="2026-08-17T11:17:14Z">
+  <w:comment w:id="15" w:author="Style Manual Check" w:initials="SMC" w:date="2026-08-18T07:22:12Z">
     <w:p>
       <w:pPr>
         <w:pStyle w:val="CommentText"/>
@@ -1310,7 +1310,7 @@
       </w:hyperlink>
     </w:p>
   </w:comment>
-  <w:comment w:id="16" w:author="Style Manual Check" w:initials="SMC" w:date="2026-08-17T11:17:14Z">
+  <w:comment w:id="16" w:author="Style Manual Check" w:initials="SMC" w:date="2026-08-18T07:22:12Z">
     <w:p>
       <w:pPr>
         <w:pStyle w:val="CommentText"/>
@@ -1354,7 +1354,7 @@
       </w:hyperlink>
     </w:p>
   </w:comment>
-  <w:comment w:id="17" w:author="Style Manual Check" w:initials="SMC" w:date="2026-08-17T11:17:14Z">
+  <w:comment w:id="17" w:author="Style Manual Check" w:initials="SMC" w:date="2026-08-18T07:22:12Z">
     <w:p>
       <w:pPr>
         <w:pStyle w:val="CommentText"/>
@@ -1434,7 +1434,7 @@
       </w:hyperlink>
     </w:p>
   </w:comment>
-  <w:comment w:id="18" w:author="Style Manual Check" w:initials="SMC" w:date="2026-08-17T11:17:14Z">
+  <w:comment w:id="18" w:author="Style Manual Check" w:initials="SMC" w:date="2026-08-18T07:22:12Z">
     <w:p>
       <w:pPr>
         <w:pStyle w:val="CommentText"/>
@@ -1478,7 +1478,7 @@
       </w:hyperlink>
     </w:p>
   </w:comment>
-  <w:comment w:id="19" w:author="Style Manual Check" w:initials="SMC" w:date="2026-08-17T11:17:14Z">
+  <w:comment w:id="19" w:author="Style Manual Check" w:initials="SMC" w:date="2026-08-18T07:22:12Z">
     <w:p>
       <w:pPr>
         <w:pStyle w:val="CommentText"/>
@@ -1522,7 +1522,7 @@
       </w:hyperlink>
     </w:p>
   </w:comment>
-  <w:comment w:id="20" w:author="Style Manual Check" w:initials="SMC" w:date="2026-08-17T11:17:14Z">
+  <w:comment w:id="20" w:author="Style Manual Check" w:initials="SMC" w:date="2026-08-18T07:22:12Z">
     <w:p>
       <w:pPr>
         <w:pStyle w:val="CommentText"/>
@@ -1566,7 +1566,7 @@
       </w:hyperlink>
     </w:p>
   </w:comment>
-  <w:comment w:id="21" w:author="Style Manual Check" w:initials="SMC" w:date="2026-08-17T11:17:14Z">
+  <w:comment w:id="21" w:author="Style Manual Check" w:initials="SMC" w:date="2026-08-18T07:22:12Z">
     <w:p>
       <w:pPr>
         <w:pStyle w:val="CommentText"/>
@@ -1610,7 +1610,7 @@
       </w:hyperlink>
     </w:p>
   </w:comment>
-  <w:comment w:id="22" w:author="Style Manual Check" w:initials="SMC" w:date="2026-08-17T11:17:14Z">
+  <w:comment w:id="22" w:author="Style Manual Check" w:initials="SMC" w:date="2026-08-18T07:22:12Z">
     <w:p>
       <w:pPr>
         <w:pStyle w:val="CommentText"/>
@@ -1654,7 +1654,7 @@
       </w:hyperlink>
     </w:p>
   </w:comment>
-  <w:comment w:id="23" w:author="Style Manual Check" w:initials="SMC" w:date="2026-08-17T11:17:14Z">
+  <w:comment w:id="23" w:author="Style Manual Check" w:initials="SMC" w:date="2026-08-18T07:22:12Z">
     <w:p>
       <w:pPr>
         <w:pStyle w:val="CommentText"/>
@@ -1698,7 +1698,7 @@
       </w:hyperlink>
     </w:p>
   </w:comment>
-  <w:comment w:id="24" w:author="Style Manual Check" w:initials="SMC" w:date="2026-08-17T11:17:14Z">
+  <w:comment w:id="24" w:author="Style Manual Check" w:initials="SMC" w:date="2026-08-18T07:22:12Z">
     <w:p>
       <w:pPr>
         <w:pStyle w:val="CommentText"/>
@@ -1742,7 +1742,7 @@
       </w:hyperlink>
     </w:p>
   </w:comment>
-  <w:comment w:id="25" w:author="Style Manual Check" w:initials="SMC" w:date="2026-08-17T11:17:14Z">
+  <w:comment w:id="25" w:author="Style Manual Check" w:initials="SMC" w:date="2026-08-18T07:22:12Z">
     <w:p>
       <w:pPr>
         <w:pStyle w:val="CommentText"/>

</xml_diff>